<commit_message>
feat: novo modelo canônico CR_CP com OVP, espectro e referências expandidas (laudo padrão validado L_184-0526)
</commit_message>
<xml_diff>
--- a/L_000-0X26_D_00XXXXX-XX_CF-PHB_ENVOLVIDO_CR_CP.docx
+++ b/L_000-0X26_D_00XXXXX-XX_CF-PHB_ENVOLVIDO_CR_CP.docx
@@ -1,6 +1,6 @@
 
 <file path=word/document.xml><?xml version="1.0" encoding="utf-8"?>
-<w:document xmlns:wpc="http://schemas.microsoft.com/office/word/2010/wordprocessingCanvas" xmlns:cx="http://schemas.microsoft.com/office/drawing/2014/chartex" xmlns:cx1="http://schemas.microsoft.com/office/drawing/2015/9/8/chartex" xmlns:cx2="http://schemas.microsoft.com/office/drawing/2015/10/21/chartex" xmlns:cx3="http://schemas.microsoft.com/office/drawing/2016/5/9/chartex" xmlns:cx4="http://schemas.microsoft.com/office/drawing/2016/5/10/chartex" xmlns:cx5="http://schemas.microsoft.com/office/drawing/2016/5/11/chartex" xmlns:cx6="http://schemas.microsoft.com/office/drawing/2016/5/12/chartex" xmlns:cx7="http://schemas.microsoft.com/office/drawing/2016/5/13/chartex" xmlns:cx8="http://schemas.microsoft.com/office/drawing/2016/5/14/chartex" xmlns:mc="http://schemas.openxmlformats.org/markup-compatibility/2006" xmlns:aink="http://schemas.microsoft.com/office/drawing/2016/ink" xmlns:am3d="http://schemas.microsoft.com/office/drawing/2017/model3d" xmlns:o="urn:schemas-microsoft-com:office:office" xmlns:r="http://schemas.openxmlformats.org/officeDocument/2006/relationships" xmlns:m="http://schemas.openxmlformats.org/officeDocument/2006/math" xmlns:v="urn:schemas-microsoft-com:vml" xmlns:wp14="http://schemas.microsoft.com/office/word/2010/wordprocessingDrawing" xmlns:wp="http://schemas.openxmlformats.org/drawingml/2006/wordprocessingDrawing" xmlns:w10="urn:schemas-microsoft-com:office:word" xmlns:w="http://schemas.openxmlformats.org/wordprocessingml/2006/main" xmlns:w14="http://schemas.microsoft.com/office/word/2010/wordml" xmlns:w15="http://schemas.microsoft.com/office/word/2012/wordml" xmlns:w16cex="http://schemas.microsoft.com/office/word/2018/wordml/cex" xmlns:w16cid="http://schemas.microsoft.com/office/word/2016/wordml/cid" xmlns:w16="http://schemas.microsoft.com/office/word/2018/wordml" xmlns:w16sdtdh="http://schemas.microsoft.com/office/word/2020/wordml/sdtdatahash" xmlns:w16se="http://schemas.microsoft.com/office/word/2015/wordml/symex" xmlns:wpg="http://schemas.microsoft.com/office/word/2010/wordprocessingGroup" xmlns:wpi="http://schemas.microsoft.com/office/word/2010/wordprocessingInk" xmlns:wne="http://schemas.microsoft.com/office/word/2006/wordml" xmlns:wps="http://schemas.microsoft.com/office/word/2010/wordprocessingShape" mc:Ignorable="w14 w15 w16se w16cid w16 w16cex w16sdtdh wp14">
+<w:document xmlns:wpc="http://schemas.microsoft.com/office/word/2010/wordprocessingCanvas" xmlns:mc="http://schemas.openxmlformats.org/markup-compatibility/2006" xmlns:o="urn:schemas-microsoft-com:office:office" xmlns:r="http://schemas.openxmlformats.org/officeDocument/2006/relationships" xmlns:m="http://schemas.openxmlformats.org/officeDocument/2006/math" xmlns:v="urn:schemas-microsoft-com:vml" xmlns:wp14="http://schemas.microsoft.com/office/word/2010/wordprocessingDrawing" xmlns:wp="http://schemas.openxmlformats.org/drawingml/2006/wordprocessingDrawing" xmlns:w10="urn:schemas-microsoft-com:office:word" xmlns:w="http://schemas.openxmlformats.org/wordprocessingml/2006/main" xmlns:w14="http://schemas.microsoft.com/office/word/2010/wordml" xmlns:w15="http://schemas.microsoft.com/office/word/2012/wordml" xmlns:wpg="http://schemas.microsoft.com/office/word/2010/wordprocessingGroup" xmlns:wpi="http://schemas.microsoft.com/office/word/2010/wordprocessingInk" xmlns:wne="http://schemas.microsoft.com/office/word/2006/wordml" xmlns:wps="http://schemas.microsoft.com/office/word/2010/wordprocessingShape" mc:Ignorable="w14 w15 wp14">
   <w:body>
     <w:p>
       <w:pPr>
@@ -123,7 +123,7 @@
           <w:sz w:val="24"/>
           <w:szCs w:val="24"/>
         </w:rPr>
-        <w:t>[TOTAL]</w:t>
+        <w:t>21</w:t>
       </w:r>
       <w:r>
         <w:rPr>
@@ -141,7 +141,7 @@
           <w:sz w:val="24"/>
           <w:szCs w:val="24"/>
         </w:rPr>
-        <w:t>[MÊS]</w:t>
+        <w:t>maio</w:t>
       </w:r>
       <w:r>
         <w:rPr>
@@ -267,7 +267,7 @@
           <w:sz w:val="24"/>
           <w:szCs w:val="24"/>
         </w:rPr>
-        <w:t>[MÊS]</w:t>
+        <w:t>maio</w:t>
       </w:r>
       <w:r>
         <w:rPr>
@@ -329,7 +329,24 @@
           <w:sz w:val="24"/>
           <w:szCs w:val="24"/>
         </w:rPr>
-        <w:t xml:space="preserve"> relacionada ao BO </w:t>
+        <w:t xml:space="preserve"> relacionada ao </w:t>
+      </w:r>
+      <w:r>
+        <w:rPr>
+          <w:rFonts w:ascii="Times New Roman" w:hAnsi="Times New Roman" w:cs="Times New Roman"/>
+          <w:b/>
+          <w:sz w:val="24"/>
+          <w:szCs w:val="24"/>
+        </w:rPr>
+        <w:t>BO</w:t>
+      </w:r>
+      <w:r>
+        <w:rPr>
+          <w:rFonts w:ascii="Times New Roman" w:hAnsi="Times New Roman" w:cs="Times New Roman"/>
+          <w:sz w:val="24"/>
+          <w:szCs w:val="24"/>
+        </w:rPr>
+        <w:t xml:space="preserve"> </w:t>
       </w:r>
       <w:r>
         <w:rPr>
@@ -829,16 +846,7 @@
           <w:sz w:val="24"/>
           <w:szCs w:val="24"/>
         </w:rPr>
-        <w:t xml:space="preserve">Para a realização do exame definitivo, procedeu-se à abertura regular do envelope de vestígios, seguida de inspeção visual, contagem dos volumes, registro fotográfico, aferição de massa bruta e </w:t>
-      </w:r>
-      <w:r>
-        <w:rPr>
-          <w:rFonts w:ascii="Times New Roman" w:hAnsi="Times New Roman" w:cs="Times New Roman"/>
-          <w:sz w:val="24"/>
-          <w:szCs w:val="24"/>
-        </w:rPr>
-        <w:lastRenderedPageBreak/>
-        <w:t>seleção de frações representativas para análise química. As constatações estão descritas na Tabela 1, a seguir.</w:t>
+        <w:t>Para a realização do exame definitivo, procedeu-se à abertura regular do envelope de vestígios, seguida de inspeção visual, contagem dos volumes, registro fotográfico, aferição de massa bruta e seleção de frações representativas para análise química. As constatações estão descritas na Tabela 1, a seguir.</w:t>
       </w:r>
     </w:p>
     <w:p>
@@ -1057,7 +1065,7 @@
                 <w:sz w:val="20"/>
                 <w:szCs w:val="20"/>
               </w:rPr>
-              <w:t>[MASSA_CR]0</w:t>
+              <w:t>[MASSA_CR]</w:t>
             </w:r>
             <w:r>
               <w:rPr>
@@ -1133,7 +1141,15 @@
                 <w:sz w:val="20"/>
                 <w:szCs w:val="20"/>
               </w:rPr>
-              <w:t>Invólucros plásticos e de papel alumínio</w:t>
+              <w:t>Tabletes e</w:t>
+            </w:r>
+            <w:r>
+              <w:rPr>
+                <w:rFonts w:ascii="Times New Roman" w:hAnsi="Times New Roman" w:cs="Times New Roman"/>
+                <w:sz w:val="20"/>
+                <w:szCs w:val="20"/>
+              </w:rPr>
+              <w:t>nvólucros plásticos e de papel alumínio</w:t>
             </w:r>
           </w:p>
         </w:tc>
@@ -1189,16 +1205,6 @@
     <w:p>
       <w:pPr>
         <w:spacing w:before="80" w:after="80"/>
-        <w:rPr>
-          <w:rFonts w:ascii="Times New Roman" w:hAnsi="Times New Roman" w:cs="Times New Roman"/>
-          <w:sz w:val="20"/>
-          <w:szCs w:val="20"/>
-        </w:rPr>
-      </w:pPr>
-    </w:p>
-    <w:p>
-      <w:pPr>
-        <w:spacing w:before="80" w:after="80"/>
         <w:jc w:val="center"/>
         <w:rPr>
           <w:rFonts w:ascii="Times New Roman" w:hAnsi="Times New Roman" w:cs="Times New Roman"/>
@@ -1215,8 +1221,8 @@
         </w:rPr>
         <w:drawing>
           <wp:inline distT="0" distB="0" distL="0" distR="0" wp14:anchorId="5F853967" wp14:editId="1580BEF0">
-            <wp:extent cx="5909310" cy="3594157"/>
-            <wp:effectExtent l="19050" t="19050" r="15240" b="25400"/>
+            <wp:extent cx="3680767" cy="3511745"/>
+            <wp:effectExtent l="19050" t="19050" r="15240" b="12700"/>
             <wp:docPr id="4" name="Imagem 4"/>
             <wp:cNvGraphicFramePr>
               <a:graphicFrameLocks xmlns:a="http://schemas.openxmlformats.org/drawingml/2006/main" noChangeAspect="1"/>
@@ -1236,7 +1242,7 @@
                   <pic:spPr bwMode="auto">
                     <a:xfrm>
                       <a:off x="0" y="0"/>
-                      <a:ext cx="5915356" cy="3597834"/>
+                      <a:ext cx="3712800" cy="3542307"/>
                     </a:xfrm>
                     <a:prstGeom prst="rect">
                       <a:avLst/>
@@ -1264,6 +1270,62 @@
     </w:p>
     <w:p>
       <w:pPr>
+        <w:jc w:val="center"/>
+        <w:rPr>
+          <w:rFonts w:ascii="Times New Roman" w:hAnsi="Times New Roman" w:cs="Times New Roman"/>
+          <w:sz w:val="24"/>
+          <w:szCs w:val="24"/>
+        </w:rPr>
+      </w:pPr>
+      <w:r>
+        <w:rPr>
+          <w:rFonts w:ascii="Times New Roman" w:hAnsi="Times New Roman" w:cs="Times New Roman"/>
+          <w:noProof/>
+          <w:sz w:val="24"/>
+          <w:szCs w:val="24"/>
+        </w:rPr>
+        <w:drawing>
+          <wp:inline distT="0" distB="0" distL="0" distR="0">
+            <wp:extent cx="3640770" cy="3561128"/>
+            <wp:effectExtent l="0" t="0" r="0" b="1270"/>
+            <wp:docPr id="99" name="Foto2_Pericial"/>
+            <wp:cNvGraphicFramePr>
+              <a:graphicFrameLocks xmlns:a="http://schemas.openxmlformats.org/drawingml/2006/main" noChangeAspect="1"/>
+            </wp:cNvGraphicFramePr>
+            <a:graphic xmlns:a="http://schemas.openxmlformats.org/drawingml/2006/main">
+              <a:graphicData uri="http://schemas.openxmlformats.org/drawingml/2006/picture">
+                <pic:pic xmlns:pic="http://schemas.openxmlformats.org/drawingml/2006/picture">
+                  <pic:nvPicPr>
+                    <pic:cNvPr id="99" name="Foto2_Pericial"/>
+                    <pic:cNvPicPr>
+                      <a:picLocks noChangeAspect="1" noChangeArrowheads="1"/>
+                    </pic:cNvPicPr>
+                  </pic:nvPicPr>
+                  <pic:blipFill>
+                    <a:blip r:embed="rId8"/>
+                    <a:stretch>
+                      <a:fillRect/>
+                    </a:stretch>
+                  </pic:blipFill>
+                  <pic:spPr bwMode="auto">
+                    <a:xfrm>
+                      <a:off x="0" y="0"/>
+                      <a:ext cx="3658883" cy="3578844"/>
+                    </a:xfrm>
+                    <a:prstGeom prst="rect">
+                      <a:avLst/>
+                    </a:prstGeom>
+                    <a:noFill/>
+                  </pic:spPr>
+                </pic:pic>
+              </a:graphicData>
+            </a:graphic>
+          </wp:inline>
+        </w:drawing>
+      </w:r>
+    </w:p>
+    <w:p>
+      <w:pPr>
         <w:spacing w:before="80" w:after="80"/>
         <w:jc w:val="center"/>
         <w:rPr>
@@ -1498,18 +1560,156 @@
         <w:spacing w:before="80" w:after="80"/>
         <w:jc w:val="both"/>
         <w:rPr>
-          <w:rFonts w:ascii="Times New Roman" w:hAnsi="Times New Roman" w:cs="Times New Roman"/>
-          <w:sz w:val="24"/>
-          <w:szCs w:val="24"/>
-        </w:rPr>
-      </w:pPr>
-      <w:r>
-        <w:rPr>
-          <w:rFonts w:ascii="Times New Roman" w:hAnsi="Times New Roman" w:cs="Times New Roman"/>
-          <w:sz w:val="24"/>
-          <w:szCs w:val="24"/>
-        </w:rPr>
-        <w:t xml:space="preserve">Para assegurar validade, rastreabilidade metrológica e reprodutibilidade dos resultados, foram adotados controles analíticos, conforme POP-QF-PHB-002 (V 1.0, 10/05/2026). </w:t>
+          <w:rFonts w:ascii="Times New Roman" w:eastAsia="Times New Roman" w:hAnsi="Times New Roman" w:cs="Times New Roman"/>
+          <w:sz w:val="24"/>
+          <w:szCs w:val="24"/>
+        </w:rPr>
+      </w:pPr>
+      <w:r>
+        <w:rPr>
+          <w:rFonts w:ascii="Times New Roman" w:hAnsi="Times New Roman" w:cs="Times New Roman"/>
+          <w:sz w:val="24"/>
+          <w:szCs w:val="24"/>
+        </w:rPr>
+        <w:t xml:space="preserve">Para assegurar validade, rastreabilidade metrológica e reprodutibilidade dos resultados, foram adotados controles analíticos, conforme POP-QF-PHB-002 (V </w:t>
+      </w:r>
+      <w:r>
+        <w:rPr>
+          <w:rFonts w:ascii="Times New Roman" w:hAnsi="Times New Roman" w:cs="Times New Roman"/>
+          <w:sz w:val="24"/>
+          <w:szCs w:val="24"/>
+        </w:rPr>
+        <w:t>1</w:t>
+      </w:r>
+      <w:r>
+        <w:rPr>
+          <w:rFonts w:ascii="Times New Roman" w:hAnsi="Times New Roman" w:cs="Times New Roman"/>
+          <w:sz w:val="24"/>
+          <w:szCs w:val="24"/>
+        </w:rPr>
+        <w:t xml:space="preserve">.0, </w:t>
+      </w:r>
+      <w:r>
+        <w:rPr>
+          <w:rFonts w:ascii="Times New Roman" w:hAnsi="Times New Roman" w:cs="Times New Roman"/>
+          <w:sz w:val="24"/>
+          <w:szCs w:val="24"/>
+        </w:rPr>
+        <w:t>10</w:t>
+      </w:r>
+      <w:r>
+        <w:rPr>
+          <w:rFonts w:ascii="Times New Roman" w:hAnsi="Times New Roman" w:cs="Times New Roman"/>
+          <w:sz w:val="24"/>
+          <w:szCs w:val="24"/>
+        </w:rPr>
+        <w:t>/0</w:t>
+      </w:r>
+      <w:r>
+        <w:rPr>
+          <w:rFonts w:ascii="Times New Roman" w:hAnsi="Times New Roman" w:cs="Times New Roman"/>
+          <w:sz w:val="24"/>
+          <w:szCs w:val="24"/>
+        </w:rPr>
+        <w:t>5</w:t>
+      </w:r>
+      <w:r>
+        <w:rPr>
+          <w:rFonts w:ascii="Times New Roman" w:hAnsi="Times New Roman" w:cs="Times New Roman"/>
+          <w:sz w:val="24"/>
+          <w:szCs w:val="24"/>
+        </w:rPr>
+        <w:t>/2026).</w:t>
+      </w:r>
+      <w:r>
+        <w:rPr>
+          <w:rFonts w:ascii="Times New Roman" w:eastAsia="Times New Roman" w:hAnsi="Times New Roman" w:cs="Times New Roman"/>
+          <w:sz w:val="24"/>
+          <w:szCs w:val="24"/>
+        </w:rPr>
+        <w:t xml:space="preserve"> O instrumento foi submetido ao Protocolo de Qualificação de Desempenho (OVP /</w:t>
+      </w:r>
+      <w:r>
+        <w:rPr>
+          <w:rFonts w:ascii="Times New Roman" w:eastAsia="Times New Roman" w:hAnsi="Times New Roman" w:cs="Times New Roman"/>
+          <w:sz w:val="24"/>
+          <w:szCs w:val="24"/>
+        </w:rPr>
+        <w:t xml:space="preserve"> PQ Test) em 1</w:t>
+      </w:r>
+      <w:r>
+        <w:rPr>
+          <w:rFonts w:ascii="Times New Roman" w:eastAsia="Times New Roman" w:hAnsi="Times New Roman" w:cs="Times New Roman"/>
+          <w:sz w:val="24"/>
+          <w:szCs w:val="24"/>
+        </w:rPr>
+        <w:t>2</w:t>
+      </w:r>
+      <w:r>
+        <w:rPr>
+          <w:rFonts w:ascii="Times New Roman" w:eastAsia="Times New Roman" w:hAnsi="Times New Roman" w:cs="Times New Roman"/>
+          <w:sz w:val="24"/>
+          <w:szCs w:val="24"/>
+        </w:rPr>
+        <w:t xml:space="preserve">/06/2026 às 14:04 h (GMT-3), </w:t>
+      </w:r>
+      <w:r>
+        <w:rPr>
+          <w:rFonts w:ascii="Times New Roman" w:eastAsia="Times New Roman" w:hAnsi="Times New Roman" w:cs="Times New Roman"/>
+          <w:sz w:val="24"/>
+          <w:szCs w:val="24"/>
+        </w:rPr>
+        <w:t xml:space="preserve">válido até [DATA_VALID_OVP] </w:t>
+      </w:r>
+      <w:r>
+        <w:rPr>
+          <w:rFonts w:ascii="Times New Roman" w:eastAsia="Times New Roman" w:hAnsi="Times New Roman" w:cs="Times New Roman"/>
+          <w:sz w:val="24"/>
+          <w:szCs w:val="24"/>
+        </w:rPr>
+        <w:t>às 14:04 h (GMT-3)</w:t>
+      </w:r>
+      <w:r>
+        <w:rPr>
+          <w:rFonts w:ascii="Times New Roman" w:eastAsia="Times New Roman" w:hAnsi="Times New Roman" w:cs="Times New Roman"/>
+          <w:sz w:val="24"/>
+          <w:szCs w:val="24"/>
+        </w:rPr>
+        <w:t xml:space="preserve">, </w:t>
+      </w:r>
+      <w:r>
+        <w:rPr>
+          <w:rFonts w:ascii="Times New Roman" w:eastAsia="Times New Roman" w:hAnsi="Times New Roman" w:cs="Times New Roman"/>
+          <w:sz w:val="24"/>
+          <w:szCs w:val="24"/>
+        </w:rPr>
+        <w:t xml:space="preserve">com resultado geral </w:t>
+      </w:r>
+      <w:r>
+        <w:rPr>
+          <w:rFonts w:ascii="Times New Roman" w:eastAsia="Times New Roman" w:hAnsi="Times New Roman" w:cs="Times New Roman"/>
+          <w:b/>
+          <w:bCs/>
+          <w:sz w:val="24"/>
+          <w:szCs w:val="24"/>
+        </w:rPr>
+        <w:t>PASSED</w:t>
+      </w:r>
+      <w:r>
+        <w:rPr>
+          <w:rFonts w:ascii="Times New Roman" w:eastAsia="Times New Roman" w:hAnsi="Times New Roman" w:cs="Times New Roman"/>
+          <w:sz w:val="24"/>
+          <w:szCs w:val="24"/>
+        </w:rPr>
+        <w:t xml:space="preserve"> (S/N medido: [SN_VALOR]; desvio da linha 100%: [LINHA100_VALOR]%; exatidão de número de onda: [DESVIO_NV] cm⁻¹ — máx. admissível ±0,50 cm⁻¹), atestando plena conformidade instrumental à época da realização dos e</w:t>
+      </w:r>
+      <w:r>
+        <w:rPr>
+          <w:rFonts w:ascii="Times New Roman" w:eastAsia="Times New Roman" w:hAnsi="Times New Roman" w:cs="Times New Roman"/>
+          <w:sz w:val="24"/>
+          <w:szCs w:val="24"/>
+        </w:rPr>
+        <w:t>xames.</w:t>
       </w:r>
     </w:p>
     <w:p>
@@ -1576,7 +1776,6 @@
           <w:sz w:val="24"/>
           <w:szCs w:val="24"/>
         </w:rPr>
-        <w:lastRenderedPageBreak/>
         <w:t>2.3.   Ensaio Colorimétrico Presuntivo — Teste de Scott Modificado</w:t>
       </w:r>
     </w:p>
@@ -1632,25 +1831,7 @@
           <w:sz w:val="24"/>
           <w:szCs w:val="24"/>
         </w:rPr>
-        <w:t>, notadamente cocaína e substâncias correlatas. O método baseia-se na reação entre a amina terciária e solução de tiocianato de cobalto (II) [</w:t>
-      </w:r>
-      <w:proofErr w:type="gramStart"/>
-      <w:r>
-        <w:rPr>
-          <w:rFonts w:ascii="Times New Roman" w:hAnsi="Times New Roman" w:cs="Times New Roman"/>
-          <w:sz w:val="24"/>
-          <w:szCs w:val="24"/>
-        </w:rPr>
-        <w:t>Co(</w:t>
-      </w:r>
-      <w:proofErr w:type="gramEnd"/>
-      <w:r>
-        <w:rPr>
-          <w:rFonts w:ascii="Times New Roman" w:hAnsi="Times New Roman" w:cs="Times New Roman"/>
-          <w:sz w:val="24"/>
-          <w:szCs w:val="24"/>
-        </w:rPr>
-        <w:t>SCN)₂], com formação de complexo azul característico.</w:t>
+        <w:t>, notadamente cocaína e substâncias correlatas. O método baseia-se na reação entre a amina terciária e solução de tiocianato de cobalto (II) [Co(SCN)₂], com formação de complexo azul característico.</w:t>
       </w:r>
       <w:r>
         <w:rPr>
@@ -1688,25 +1869,7 @@
           <w:sz w:val="24"/>
           <w:szCs w:val="24"/>
         </w:rPr>
-        <w:t xml:space="preserve"> </w:t>
-      </w:r>
-      <w:proofErr w:type="gramStart"/>
-      <w:r>
-        <w:rPr>
-          <w:rFonts w:ascii="Times New Roman" w:hAnsi="Times New Roman" w:cs="Times New Roman"/>
-          <w:sz w:val="24"/>
-          <w:szCs w:val="24"/>
-        </w:rPr>
-        <w:t>Co(</w:t>
-      </w:r>
-      <w:proofErr w:type="gramEnd"/>
-      <w:r>
-        <w:rPr>
-          <w:rFonts w:ascii="Times New Roman" w:hAnsi="Times New Roman" w:cs="Times New Roman"/>
-          <w:sz w:val="24"/>
-          <w:szCs w:val="24"/>
-        </w:rPr>
-        <w:t xml:space="preserve">SCN)₂ (solução 1% aquosa); </w:t>
+        <w:t xml:space="preserve"> Co(SCN)₂ (solução 1% aquosa); </w:t>
       </w:r>
       <w:proofErr w:type="spellStart"/>
       <w:r>
@@ -1806,25 +1969,7 @@
           <w:sz w:val="24"/>
           <w:szCs w:val="24"/>
         </w:rPr>
-        <w:t xml:space="preserve"> — formação do complexo azul [</w:t>
-      </w:r>
-      <w:proofErr w:type="gramStart"/>
-      <w:r>
-        <w:rPr>
-          <w:rFonts w:ascii="Times New Roman" w:hAnsi="Times New Roman" w:cs="Times New Roman"/>
-          <w:sz w:val="24"/>
-          <w:szCs w:val="24"/>
-        </w:rPr>
-        <w:t>Co(</w:t>
-      </w:r>
-      <w:proofErr w:type="gramEnd"/>
-      <w:r>
-        <w:rPr>
-          <w:rFonts w:ascii="Times New Roman" w:hAnsi="Times New Roman" w:cs="Times New Roman"/>
-          <w:sz w:val="24"/>
-          <w:szCs w:val="24"/>
-        </w:rPr>
-        <w:t xml:space="preserve">SCN)₂·alcaloide]; </w:t>
+        <w:t xml:space="preserve"> — formação do complexo azul [Co(SCN)₂·alcaloide]; </w:t>
       </w:r>
       <w:r>
         <w:rPr>
@@ -1941,11 +2086,11 @@
                     </pic:cNvPicPr>
                   </pic:nvPicPr>
                   <pic:blipFill>
-                    <a:blip r:embed="rId8">
+                    <a:blip r:embed="rId9">
                       <a:extLst>
                         <a:ext uri="{BEBA8EAE-BF5A-486C-A8C5-ECC9F3942E4B}">
                           <a14:imgProps xmlns:a14="http://schemas.microsoft.com/office/drawing/2010/main">
-                            <a14:imgLayer r:embed="rId9">
+                            <a14:imgLayer r:embed="rId10">
                               <a14:imgEffect>
                                 <a14:sharpenSoften amount="50000"/>
                               </a14:imgEffect>
@@ -2164,7 +2309,7 @@
       </w:r>
       <w:r>
         <w:rPr>
-          <w:rFonts w:ascii="Times New Roman" w:hAnsi="Times New Roman" w:cs="Times New Roman"/>
+          <w:rFonts w:ascii="Times New Roman" w:eastAsia="Times New Roman" w:hAnsi="Times New Roman" w:cs="Times New Roman"/>
           <w:sz w:val="24"/>
           <w:szCs w:val="24"/>
         </w:rPr>
@@ -2173,10 +2318,7 @@
       <w:proofErr w:type="spellStart"/>
       <w:r>
         <w:rPr>
-          <w:rStyle w:val="Forte"/>
-          <w:rFonts w:ascii="Times New Roman" w:hAnsi="Times New Roman" w:cs="Times New Roman"/>
-          <w:b w:val="0"/>
-          <w:bCs w:val="0"/>
+          <w:rFonts w:ascii="Times New Roman" w:eastAsia="Times New Roman" w:hAnsi="Times New Roman" w:cs="Times New Roman"/>
           <w:i/>
           <w:iCs/>
           <w:sz w:val="24"/>
@@ -2187,10 +2329,7 @@
       <w:proofErr w:type="spellEnd"/>
       <w:r>
         <w:rPr>
-          <w:rStyle w:val="Forte"/>
-          <w:rFonts w:ascii="Times New Roman" w:hAnsi="Times New Roman" w:cs="Times New Roman"/>
-          <w:b w:val="0"/>
-          <w:bCs w:val="0"/>
+          <w:rFonts w:ascii="Times New Roman" w:eastAsia="Times New Roman" w:hAnsi="Times New Roman" w:cs="Times New Roman"/>
           <w:i/>
           <w:iCs/>
           <w:sz w:val="24"/>
@@ -2200,202 +2339,209 @@
       </w:r>
       <w:r>
         <w:rPr>
-          <w:rFonts w:ascii="Times New Roman" w:hAnsi="Times New Roman" w:cs="Times New Roman"/>
-          <w:sz w:val="24"/>
-          <w:szCs w:val="24"/>
-        </w:rPr>
-        <w:t>, equipado com acessório de Reflectância Total Atenuada (ATR) com cristal de diamante, operando na região espectral de 4000 a 650 cm⁻¹, com 16 varreduras (</w:t>
+          <w:rFonts w:ascii="Times New Roman" w:eastAsia="Times New Roman" w:hAnsi="Times New Roman" w:cs="Times New Roman"/>
+          <w:sz w:val="24"/>
+          <w:szCs w:val="24"/>
+        </w:rPr>
+        <w:t xml:space="preserve"> (nº de série 210363), equipado com acessório de </w:t>
       </w:r>
       <w:proofErr w:type="spellStart"/>
       <w:r>
         <w:rPr>
-          <w:rStyle w:val="nfase"/>
-          <w:rFonts w:ascii="Times New Roman" w:hAnsi="Times New Roman" w:cs="Times New Roman"/>
-          <w:sz w:val="24"/>
-          <w:szCs w:val="24"/>
-        </w:rPr>
-        <w:t>scans</w:t>
+          <w:rFonts w:ascii="Times New Roman" w:eastAsia="Times New Roman" w:hAnsi="Times New Roman" w:cs="Times New Roman"/>
+          <w:sz w:val="24"/>
+          <w:szCs w:val="24"/>
+        </w:rPr>
+        <w:t>Reflectância</w:t>
       </w:r>
       <w:proofErr w:type="spellEnd"/>
       <w:r>
         <w:rPr>
-          <w:rFonts w:ascii="Times New Roman" w:hAnsi="Times New Roman" w:cs="Times New Roman"/>
-          <w:sz w:val="24"/>
-          <w:szCs w:val="24"/>
-        </w:rPr>
-        <w:t xml:space="preserve">) e resolução de 4 cm⁻¹. O processamento e a identificação espectral foram realizados pelo software </w:t>
-      </w:r>
-      <w:r>
-        <w:rPr>
-          <w:rStyle w:val="nfase"/>
-          <w:rFonts w:ascii="Times New Roman" w:hAnsi="Times New Roman" w:cs="Times New Roman"/>
-          <w:sz w:val="24"/>
-          <w:szCs w:val="24"/>
-        </w:rPr>
-        <w:t xml:space="preserve">OPUS </w:t>
+          <w:rFonts w:ascii="Times New Roman" w:eastAsia="Times New Roman" w:hAnsi="Times New Roman" w:cs="Times New Roman"/>
+          <w:sz w:val="24"/>
+          <w:szCs w:val="24"/>
+        </w:rPr>
+        <w:t xml:space="preserve"> Total Atenuada (ATR) com cristal de diamante (ATR Platinum T — 1 reflexão), operando na região espectral de 4000 a 650 cm⁻¹, com 16 varreduras (</w:t>
       </w:r>
       <w:proofErr w:type="spellStart"/>
       <w:r>
         <w:rPr>
-          <w:rStyle w:val="nfase"/>
-          <w:rFonts w:ascii="Times New Roman" w:hAnsi="Times New Roman" w:cs="Times New Roman"/>
-          <w:sz w:val="24"/>
-          <w:szCs w:val="24"/>
-        </w:rPr>
-        <w:t>DrugID</w:t>
-      </w:r>
-      <w:proofErr w:type="spellEnd"/>
-      <w:r>
-        <w:rPr>
-          <w:rStyle w:val="nfase"/>
-          <w:rFonts w:ascii="Times New Roman" w:hAnsi="Times New Roman" w:cs="Times New Roman"/>
-          <w:sz w:val="24"/>
-          <w:szCs w:val="24"/>
-        </w:rPr>
-        <w:t xml:space="preserve"> </w:t>
-      </w:r>
-      <w:proofErr w:type="spellStart"/>
-      <w:r>
-        <w:rPr>
-          <w:rStyle w:val="nfase"/>
-          <w:rFonts w:ascii="Times New Roman" w:hAnsi="Times New Roman" w:cs="Times New Roman"/>
-          <w:sz w:val="24"/>
-          <w:szCs w:val="24"/>
-        </w:rPr>
-        <w:t>Wizard</w:t>
-      </w:r>
-      <w:proofErr w:type="spellEnd"/>
-      <w:r>
-        <w:rPr>
-          <w:rFonts w:ascii="Times New Roman" w:hAnsi="Times New Roman" w:cs="Times New Roman"/>
-          <w:sz w:val="24"/>
-          <w:szCs w:val="24"/>
-        </w:rPr>
-        <w:t xml:space="preserve"> (</w:t>
-      </w:r>
-      <w:proofErr w:type="spellStart"/>
-      <w:r>
-        <w:rPr>
-          <w:rFonts w:ascii="Times New Roman" w:hAnsi="Times New Roman" w:cs="Times New Roman"/>
-          <w:sz w:val="24"/>
-          <w:szCs w:val="24"/>
-        </w:rPr>
-        <w:t>Bruker</w:t>
-      </w:r>
-      <w:proofErr w:type="spellEnd"/>
-      <w:r>
-        <w:rPr>
-          <w:rFonts w:ascii="Times New Roman" w:hAnsi="Times New Roman" w:cs="Times New Roman"/>
-          <w:sz w:val="24"/>
-          <w:szCs w:val="24"/>
-        </w:rPr>
-        <w:t xml:space="preserve"> </w:t>
-      </w:r>
-      <w:proofErr w:type="spellStart"/>
-      <w:r>
-        <w:rPr>
-          <w:rFonts w:ascii="Times New Roman" w:hAnsi="Times New Roman" w:cs="Times New Roman"/>
-          <w:sz w:val="24"/>
-          <w:szCs w:val="24"/>
-        </w:rPr>
-        <w:t>Optik</w:t>
-      </w:r>
-      <w:proofErr w:type="spellEnd"/>
-      <w:r>
-        <w:rPr>
-          <w:rFonts w:ascii="Times New Roman" w:hAnsi="Times New Roman" w:cs="Times New Roman"/>
-          <w:sz w:val="24"/>
-          <w:szCs w:val="24"/>
-        </w:rPr>
-        <w:t xml:space="preserve"> GmbH)</w:t>
-      </w:r>
-      <w:r>
-        <w:rPr>
-          <w:rFonts w:ascii="Times New Roman" w:hAnsi="Times New Roman" w:cs="Times New Roman"/>
-          <w:sz w:val="24"/>
-          <w:szCs w:val="24"/>
-        </w:rPr>
-        <w:t>.</w:t>
-      </w:r>
-    </w:p>
-    <w:p>
-      <w:pPr>
-        <w:spacing w:before="80" w:after="80"/>
-        <w:jc w:val="both"/>
-        <w:rPr>
-          <w:rFonts w:ascii="Times New Roman" w:hAnsi="Times New Roman" w:cs="Times New Roman"/>
-          <w:sz w:val="24"/>
-          <w:szCs w:val="24"/>
-        </w:rPr>
-      </w:pPr>
-      <w:r>
-        <w:rPr>
-          <w:rFonts w:ascii="Times New Roman" w:hAnsi="Times New Roman" w:cs="Times New Roman"/>
-          <w:sz w:val="24"/>
-          <w:szCs w:val="24"/>
-        </w:rPr>
-        <w:t xml:space="preserve">Os espectros obtidos foram salvos para garantia da cadeia de custódia e rastreabilidade do material, conforme POP SENASP nº 9.09 (2024), e comparado com espectros de referência por meio do software </w:t>
-      </w:r>
-      <w:r>
-        <w:rPr>
-          <w:rFonts w:ascii="Times New Roman" w:hAnsi="Times New Roman" w:cs="Times New Roman"/>
+          <w:rFonts w:ascii="Times New Roman" w:eastAsia="Times New Roman" w:hAnsi="Times New Roman" w:cs="Times New Roman"/>
           <w:i/>
           <w:iCs/>
           <w:sz w:val="24"/>
           <w:szCs w:val="24"/>
         </w:rPr>
-        <w:t xml:space="preserve">OPUS </w:t>
-      </w:r>
-      <w:proofErr w:type="spellStart"/>
-      <w:r>
-        <w:rPr>
-          <w:rFonts w:ascii="Times New Roman" w:hAnsi="Times New Roman" w:cs="Times New Roman"/>
+        <w:t>scans</w:t>
+      </w:r>
+      <w:proofErr w:type="spellEnd"/>
+      <w:r>
+        <w:rPr>
+          <w:rFonts w:ascii="Times New Roman" w:eastAsia="Times New Roman" w:hAnsi="Times New Roman" w:cs="Times New Roman"/>
+          <w:sz w:val="24"/>
+          <w:szCs w:val="24"/>
+        </w:rPr>
+        <w:t xml:space="preserve">) e resolução de 4 cm⁻¹. O processamento e a identificação espectral foram realizados pelo software </w:t>
+      </w:r>
+      <w:r>
+        <w:rPr>
+          <w:rFonts w:ascii="Times New Roman" w:eastAsia="Times New Roman" w:hAnsi="Times New Roman" w:cs="Times New Roman"/>
           <w:i/>
           <w:iCs/>
           <w:sz w:val="24"/>
           <w:szCs w:val="24"/>
         </w:rPr>
-        <w:t>DrugID</w:t>
-      </w:r>
-      <w:proofErr w:type="spellEnd"/>
-      <w:r>
-        <w:rPr>
-          <w:rFonts w:ascii="Times New Roman" w:hAnsi="Times New Roman" w:cs="Times New Roman"/>
+        <w:t xml:space="preserve">OPUS </w:t>
+      </w:r>
+      <w:proofErr w:type="spellStart"/>
+      <w:r>
+        <w:rPr>
+          <w:rFonts w:ascii="Times New Roman" w:eastAsia="Times New Roman" w:hAnsi="Times New Roman" w:cs="Times New Roman"/>
           <w:i/>
           <w:iCs/>
           <w:sz w:val="24"/>
           <w:szCs w:val="24"/>
         </w:rPr>
-        <w:t xml:space="preserve"> </w:t>
-      </w:r>
-      <w:proofErr w:type="spellStart"/>
-      <w:r>
-        <w:rPr>
-          <w:rFonts w:ascii="Times New Roman" w:hAnsi="Times New Roman" w:cs="Times New Roman"/>
+        <w:t>DrugID</w:t>
+      </w:r>
+      <w:proofErr w:type="spellEnd"/>
+      <w:r>
+        <w:rPr>
+          <w:rFonts w:ascii="Times New Roman" w:eastAsia="Times New Roman" w:hAnsi="Times New Roman" w:cs="Times New Roman"/>
           <w:i/>
           <w:iCs/>
           <w:sz w:val="24"/>
           <w:szCs w:val="24"/>
         </w:rPr>
-        <w:t>Wizard</w:t>
-      </w:r>
-      <w:proofErr w:type="spellEnd"/>
-      <w:r>
-        <w:rPr>
-          <w:rFonts w:ascii="Times New Roman" w:hAnsi="Times New Roman" w:cs="Times New Roman"/>
-          <w:sz w:val="24"/>
-          <w:szCs w:val="24"/>
-        </w:rPr>
-        <w:t>. A avaliação não se limitou ao índice de correspondência (</w:t>
-      </w:r>
-      <w:r>
-        <w:rPr>
-          <w:rFonts w:ascii="Times New Roman" w:hAnsi="Times New Roman" w:cs="Times New Roman"/>
+        <w:t xml:space="preserve"> </w:t>
+      </w:r>
+      <w:proofErr w:type="spellStart"/>
+      <w:r>
+        <w:rPr>
+          <w:rFonts w:ascii="Times New Roman" w:eastAsia="Times New Roman" w:hAnsi="Times New Roman" w:cs="Times New Roman"/>
           <w:i/>
           <w:iCs/>
           <w:sz w:val="24"/>
           <w:szCs w:val="24"/>
         </w:rPr>
+        <w:t>Wizard</w:t>
+      </w:r>
+      <w:proofErr w:type="spellEnd"/>
+      <w:r>
+        <w:rPr>
+          <w:rFonts w:ascii="Times New Roman" w:eastAsia="Times New Roman" w:hAnsi="Times New Roman" w:cs="Times New Roman"/>
+          <w:sz w:val="24"/>
+          <w:szCs w:val="24"/>
+        </w:rPr>
+        <w:t xml:space="preserve"> (</w:t>
+      </w:r>
+      <w:proofErr w:type="spellStart"/>
+      <w:r>
+        <w:rPr>
+          <w:rFonts w:ascii="Times New Roman" w:eastAsia="Times New Roman" w:hAnsi="Times New Roman" w:cs="Times New Roman"/>
+          <w:sz w:val="24"/>
+          <w:szCs w:val="24"/>
+        </w:rPr>
+        <w:t>Bruker</w:t>
+      </w:r>
+      <w:proofErr w:type="spellEnd"/>
+      <w:r>
+        <w:rPr>
+          <w:rFonts w:ascii="Times New Roman" w:eastAsia="Times New Roman" w:hAnsi="Times New Roman" w:cs="Times New Roman"/>
+          <w:sz w:val="24"/>
+          <w:szCs w:val="24"/>
+        </w:rPr>
+        <w:t xml:space="preserve"> </w:t>
+      </w:r>
+      <w:proofErr w:type="spellStart"/>
+      <w:r>
+        <w:rPr>
+          <w:rFonts w:ascii="Times New Roman" w:eastAsia="Times New Roman" w:hAnsi="Times New Roman" w:cs="Times New Roman"/>
+          <w:sz w:val="24"/>
+          <w:szCs w:val="24"/>
+        </w:rPr>
+        <w:t>Optik</w:t>
+      </w:r>
+      <w:proofErr w:type="spellEnd"/>
+      <w:r>
+        <w:rPr>
+          <w:rFonts w:ascii="Times New Roman" w:eastAsia="Times New Roman" w:hAnsi="Times New Roman" w:cs="Times New Roman"/>
+          <w:sz w:val="24"/>
+          <w:szCs w:val="24"/>
+        </w:rPr>
+        <w:t xml:space="preserve"> </w:t>
+      </w:r>
+      <w:proofErr w:type="spellStart"/>
+      <w:r>
+        <w:rPr>
+          <w:rFonts w:ascii="Times New Roman" w:eastAsia="Times New Roman" w:hAnsi="Times New Roman" w:cs="Times New Roman"/>
+          <w:sz w:val="24"/>
+          <w:szCs w:val="24"/>
+        </w:rPr>
+        <w:t>GmbH</w:t>
+      </w:r>
+      <w:proofErr w:type="spellEnd"/>
+      <w:r>
+        <w:rPr>
+          <w:rFonts w:ascii="Times New Roman" w:eastAsia="Times New Roman" w:hAnsi="Times New Roman" w:cs="Times New Roman"/>
+          <w:sz w:val="24"/>
+          <w:szCs w:val="24"/>
+        </w:rPr>
+        <w:t>), versão 8.2 Build 8.2.28 / DB 8.2.28.242.</w:t>
+      </w:r>
+    </w:p>
+    <w:p>
+      <w:pPr>
+        <w:pStyle w:val="SemEspaamento"/>
+        <w:jc w:val="both"/>
+        <w:rPr>
+          <w:rFonts w:ascii="Times New Roman" w:hAnsi="Times New Roman" w:cs="Times New Roman"/>
+          <w:sz w:val="24"/>
+          <w:szCs w:val="24"/>
+        </w:rPr>
+      </w:pPr>
+      <w:r>
+        <w:rPr>
+          <w:rFonts w:ascii="Times New Roman" w:hAnsi="Times New Roman" w:cs="Times New Roman"/>
+          <w:sz w:val="24"/>
+          <w:szCs w:val="24"/>
+        </w:rPr>
+        <w:t xml:space="preserve">Os espectros obtidos foram salvos para garantia da cadeia de custódia e rastreabilidade do material, conforme POP SENASP nº 9.09 (2024), e comparados com espectros de referência por meio do software </w:t>
+      </w:r>
+      <w:r>
+        <w:rPr>
+          <w:rFonts w:ascii="Times New Roman" w:hAnsi="Times New Roman" w:cs="Times New Roman"/>
+          <w:i/>
+          <w:iCs/>
+          <w:sz w:val="24"/>
+          <w:szCs w:val="24"/>
+        </w:rPr>
+        <w:t>OPUS DrugID Wizard</w:t>
+      </w:r>
+      <w:r>
+        <w:rPr>
+          <w:rFonts w:ascii="Times New Roman" w:hAnsi="Times New Roman" w:cs="Times New Roman"/>
+          <w:sz w:val="24"/>
+          <w:szCs w:val="24"/>
+        </w:rPr>
+        <w:t xml:space="preserve">. A avaliação não se limitou ao índice </w:t>
+      </w:r>
+      <w:r>
+        <w:rPr>
+          <w:rFonts w:ascii="Times New Roman" w:hAnsi="Times New Roman" w:cs="Times New Roman"/>
+          <w:sz w:val="24"/>
+          <w:szCs w:val="24"/>
+        </w:rPr>
+        <w:t>de correspondência (</w:t>
+      </w:r>
+      <w:r>
+        <w:rPr>
+          <w:rFonts w:ascii="Times New Roman" w:hAnsi="Times New Roman" w:cs="Times New Roman"/>
+          <w:i/>
+          <w:iCs/>
+          <w:sz w:val="24"/>
+          <w:szCs w:val="24"/>
+        </w:rPr>
         <w:t>match</w:t>
       </w:r>
       <w:r>
@@ -2422,43 +2568,15 @@
           <w:sz w:val="24"/>
           <w:szCs w:val="24"/>
         </w:rPr>
-        <w:t xml:space="preserve"> conforme POP SENASP nº 9.09 (2024, §5): (i) avaliação da aparência geral do espectro; (</w:t>
-      </w:r>
-      <w:proofErr w:type="spellStart"/>
-      <w:r>
-        <w:rPr>
-          <w:rFonts w:ascii="Times New Roman" w:hAnsi="Times New Roman" w:cs="Times New Roman"/>
-          <w:sz w:val="24"/>
-          <w:szCs w:val="24"/>
-        </w:rPr>
-        <w:t>ii</w:t>
-      </w:r>
-      <w:proofErr w:type="spellEnd"/>
-      <w:r>
-        <w:rPr>
-          <w:rFonts w:ascii="Times New Roman" w:hAnsi="Times New Roman" w:cs="Times New Roman"/>
-          <w:sz w:val="24"/>
-          <w:szCs w:val="24"/>
-        </w:rPr>
-        <w:t>) identificação das bandas diagnósticas principais do padrão de referência; (</w:t>
-      </w:r>
-      <w:proofErr w:type="spellStart"/>
-      <w:r>
-        <w:rPr>
-          <w:rFonts w:ascii="Times New Roman" w:hAnsi="Times New Roman" w:cs="Times New Roman"/>
-          <w:sz w:val="24"/>
-          <w:szCs w:val="24"/>
-        </w:rPr>
-        <w:t>iii</w:t>
-      </w:r>
-      <w:proofErr w:type="spellEnd"/>
-      <w:r>
-        <w:rPr>
-          <w:rFonts w:ascii="Times New Roman" w:hAnsi="Times New Roman" w:cs="Times New Roman"/>
-          <w:sz w:val="24"/>
-          <w:szCs w:val="24"/>
-        </w:rPr>
-        <w:t>) localização dessas bandas no espectro questionado (tolerância ±4 cm⁻¹).</w:t>
+        <w:t xml:space="preserve"> conforme POP SENASP nº 9.09 (2024, §5): (i) avaliação da aparência geral do espectro; (ii) identificação das bandas diagnósticas principais do padrão de refer</w:t>
+      </w:r>
+      <w:r>
+        <w:rPr>
+          <w:rFonts w:ascii="Times New Roman" w:hAnsi="Times New Roman" w:cs="Times New Roman"/>
+          <w:sz w:val="24"/>
+          <w:szCs w:val="24"/>
+        </w:rPr>
+        <w:t>ência; (iii) localização dessas bandas no espectro questionado.</w:t>
       </w:r>
       <w:r>
         <w:rPr>
@@ -2467,7 +2585,40 @@
           <w:sz w:val="24"/>
           <w:szCs w:val="24"/>
         </w:rPr>
+        <w:t xml:space="preserve"> </w:t>
+      </w:r>
+      <w:r>
+        <w:rPr>
+          <w:rStyle w:val="Refdenotaderodap"/>
+          <w:rFonts w:ascii="Times New Roman" w:hAnsi="Times New Roman" w:cs="Times New Roman"/>
+          <w:sz w:val="24"/>
+          <w:szCs w:val="24"/>
+        </w:rPr>
         <w:footnoteReference w:id="3"/>
+      </w:r>
+      <w:r>
+        <w:rPr>
+          <w:rFonts w:ascii="Times New Roman" w:hAnsi="Times New Roman" w:cs="Times New Roman"/>
+          <w:sz w:val="24"/>
+          <w:szCs w:val="24"/>
+        </w:rPr>
+        <w:t xml:space="preserve"> </w:t>
+      </w:r>
+      <w:r>
+        <w:rPr>
+          <w:rFonts w:ascii="Times New Roman" w:hAnsi="Times New Roman" w:cs="Times New Roman"/>
+          <w:sz w:val="24"/>
+          <w:szCs w:val="24"/>
+        </w:rPr>
+        <w:t>A tolerância declarada de ±4 cm⁻¹ é tecnicamente conservadora em relação à exatidão de número de onda verificada instrumentalmente pelo OVP vigente (desvio medido: [DESVIO_NV] cm⁻¹), conferindo marge</w:t>
+      </w:r>
+      <w:r>
+        <w:rPr>
+          <w:rFonts w:ascii="Times New Roman" w:hAnsi="Times New Roman" w:cs="Times New Roman"/>
+          <w:sz w:val="24"/>
+          <w:szCs w:val="24"/>
+        </w:rPr>
+        <w:t>m analítica adicional de segurança às identificações realizadas.</w:t>
       </w:r>
     </w:p>
     <w:p>
@@ -2485,7 +2636,6 @@
         <w:rPr>
           <w:noProof/>
         </w:rPr>
-        <w:lastRenderedPageBreak/>
         <w:drawing>
           <wp:anchor distT="0" distB="0" distL="114300" distR="114300" simplePos="0" relativeHeight="251659264" behindDoc="0" locked="0" layoutInCell="1" allowOverlap="1" wp14:anchorId="6F6C15E3" wp14:editId="2730C84B">
             <wp:simplePos x="0" y="0"/>
@@ -2512,7 +2662,7 @@
                     </pic:cNvPicPr>
                   </pic:nvPicPr>
                   <pic:blipFill>
-                    <a:blip r:embed="rId10" cstate="print">
+                    <a:blip r:embed="rId11" cstate="print">
                       <a:extLst>
                         <a:ext uri="{28A0092B-C50C-407E-A947-70E740481C1C}">
                           <a14:useLocalDpi xmlns:a14="http://schemas.microsoft.com/office/drawing/2010/main" val="0"/>
@@ -2867,29 +3017,7 @@
                 <w:sz w:val="20"/>
                 <w:szCs w:val="20"/>
               </w:rPr>
-              <w:t>Formação de precipitado azul [</w:t>
-            </w:r>
-            <w:proofErr w:type="gramStart"/>
-            <w:r>
-              <w:rPr>
-                <w:rFonts w:ascii="Times New Roman" w:hAnsi="Times New Roman" w:cs="Times New Roman"/>
-                <w:i/>
-                <w:iCs/>
-                <w:sz w:val="20"/>
-                <w:szCs w:val="20"/>
-              </w:rPr>
-              <w:t>Co(</w:t>
-            </w:r>
-            <w:proofErr w:type="gramEnd"/>
-            <w:r>
-              <w:rPr>
-                <w:rFonts w:ascii="Times New Roman" w:hAnsi="Times New Roman" w:cs="Times New Roman"/>
-                <w:i/>
-                <w:iCs/>
-                <w:sz w:val="20"/>
-                <w:szCs w:val="20"/>
-              </w:rPr>
-              <w:t>SCN)₂·cocaína]</w:t>
+              <w:t>Formação de precipitado azul [Co(SCN)₂·cocaína]</w:t>
             </w:r>
           </w:p>
         </w:tc>
@@ -3045,6 +3173,7 @@
                 <w:sz w:val="20"/>
                 <w:szCs w:val="20"/>
               </w:rPr>
+              <w:lastRenderedPageBreak/>
               <w:t>a.</w:t>
             </w:r>
           </w:p>
@@ -3220,7 +3349,7 @@
     </w:p>
     <w:p>
       <w:pPr>
-        <w:spacing w:before="80" w:after="80"/>
+        <w:pStyle w:val="SemEspaamento"/>
         <w:jc w:val="both"/>
         <w:rPr>
           <w:rFonts w:ascii="Times New Roman" w:hAnsi="Times New Roman" w:cs="Times New Roman"/>
@@ -3235,6 +3364,24 @@
           <w:szCs w:val="24"/>
         </w:rPr>
         <w:t xml:space="preserve">Na análise por FTIR-ATR, o espectro obtido apresentou compatibilidade com o padrão de </w:t>
+      </w:r>
+      <w:r>
+        <w:rPr>
+          <w:rFonts w:ascii="Times New Roman" w:hAnsi="Times New Roman" w:cs="Times New Roman"/>
+          <w:b/>
+          <w:iCs/>
+          <w:sz w:val="24"/>
+          <w:szCs w:val="24"/>
+        </w:rPr>
+        <w:t>cocaína base (benzoilmetilecgonina)</w:t>
+      </w:r>
+      <w:r>
+        <w:rPr>
+          <w:rFonts w:ascii="Times New Roman" w:hAnsi="Times New Roman" w:cs="Times New Roman"/>
+          <w:sz w:val="24"/>
+          <w:szCs w:val="24"/>
+        </w:rPr>
+        <w:t xml:space="preserve"> em biblioteca de referência (</w:t>
       </w:r>
       <w:r>
         <w:rPr>
@@ -3244,9 +3391,52 @@
           <w:sz w:val="24"/>
           <w:szCs w:val="24"/>
         </w:rPr>
-        <w:t>cocaína base (</w:t>
-      </w:r>
-      <w:proofErr w:type="spellStart"/>
+        <w:t>[BIBLIOTECA]</w:t>
+      </w:r>
+      <w:r>
+        <w:rPr>
+          <w:rFonts w:ascii="Times New Roman" w:hAnsi="Times New Roman" w:cs="Times New Roman"/>
+          <w:sz w:val="24"/>
+          <w:szCs w:val="24"/>
+        </w:rPr>
+        <w:t xml:space="preserve">, entrada nº [ENTRADA_NR]) consultada por meio do software </w:t>
+      </w:r>
+      <w:r>
+        <w:rPr>
+          <w:rFonts w:ascii="Times New Roman" w:hAnsi="Times New Roman" w:cs="Times New Roman"/>
+          <w:i/>
+          <w:iCs/>
+          <w:sz w:val="24"/>
+          <w:szCs w:val="24"/>
+        </w:rPr>
+        <w:t>OPUS DrugID Wizard</w:t>
+      </w:r>
+      <w:r>
+        <w:rPr>
+          <w:rFonts w:ascii="Times New Roman" w:hAnsi="Times New Roman" w:cs="Times New Roman"/>
+          <w:sz w:val="24"/>
+          <w:szCs w:val="24"/>
+        </w:rPr>
+        <w:t>, com índice de correspondência (</w:t>
+      </w:r>
+      <w:r>
+        <w:rPr>
+          <w:rFonts w:ascii="Times New Roman" w:hAnsi="Times New Roman" w:cs="Times New Roman"/>
+          <w:i/>
+          <w:iCs/>
+          <w:sz w:val="24"/>
+          <w:szCs w:val="24"/>
+        </w:rPr>
+        <w:t>hit quality</w:t>
+      </w:r>
+      <w:r>
+        <w:rPr>
+          <w:rFonts w:ascii="Times New Roman" w:hAnsi="Times New Roman" w:cs="Times New Roman"/>
+          <w:sz w:val="24"/>
+          <w:szCs w:val="24"/>
+        </w:rPr>
+        <w:t xml:space="preserve">) de </w:t>
+      </w:r>
       <w:r>
         <w:rPr>
           <w:rFonts w:ascii="Times New Roman" w:hAnsi="Times New Roman" w:cs="Times New Roman"/>
@@ -3255,9 +3445,51 @@
           <w:sz w:val="24"/>
           <w:szCs w:val="24"/>
         </w:rPr>
-        <w:t>benzoilmetilecgonina</w:t>
-      </w:r>
-      <w:proofErr w:type="spellEnd"/>
+        <w:t>[HIT_QUALITY]</w:t>
+      </w:r>
+      <w:r>
+        <w:rPr>
+          <w:rFonts w:ascii="Times New Roman" w:hAnsi="Times New Roman" w:cs="Times New Roman"/>
+          <w:b/>
+          <w:sz w:val="24"/>
+          <w:szCs w:val="24"/>
+        </w:rPr>
+        <w:t>/1000</w:t>
+      </w:r>
+      <w:r>
+        <w:rPr>
+          <w:rFonts w:ascii="Times New Roman" w:hAnsi="Times New Roman" w:cs="Times New Roman"/>
+          <w:sz w:val="24"/>
+          <w:szCs w:val="24"/>
+        </w:rPr>
+        <w:t xml:space="preserve">, arquivo de espectro: </w:t>
+      </w:r>
+      <w:r>
+        <w:rPr>
+          <w:rFonts w:ascii="Times New Roman" w:hAnsi="Times New Roman" w:cs="Times New Roman"/>
+          <w:i/>
+          <w:iCs/>
+          <w:sz w:val="24"/>
+          <w:szCs w:val="24"/>
+        </w:rPr>
+        <w:t>[ARQUIVO_ESP]</w:t>
+      </w:r>
+      <w:r>
+        <w:rPr>
+          <w:rFonts w:ascii="Times New Roman" w:hAnsi="Times New Roman" w:cs="Times New Roman"/>
+          <w:sz w:val="24"/>
+          <w:szCs w:val="24"/>
+        </w:rPr>
+        <w:t>, medição real</w:t>
+      </w:r>
+      <w:r>
+        <w:rPr>
+          <w:rFonts w:ascii="Times New Roman" w:hAnsi="Times New Roman" w:cs="Times New Roman"/>
+          <w:sz w:val="24"/>
+          <w:szCs w:val="24"/>
+        </w:rPr>
+        <w:t xml:space="preserve">izada em [DATA_ESP]. Observou-se concordância com bandas espectrais diagnósticas atribuíveis à </w:t>
+      </w:r>
       <w:r>
         <w:rPr>
           <w:rFonts w:ascii="Times New Roman" w:hAnsi="Times New Roman" w:cs="Times New Roman"/>
@@ -3266,153 +3498,41 @@
           <w:sz w:val="24"/>
           <w:szCs w:val="24"/>
         </w:rPr>
-        <w:t>)</w:t>
-      </w:r>
-      <w:r>
-        <w:rPr>
-          <w:rFonts w:ascii="Times New Roman" w:hAnsi="Times New Roman" w:cs="Times New Roman"/>
-          <w:sz w:val="24"/>
-          <w:szCs w:val="24"/>
-        </w:rPr>
-        <w:t xml:space="preserve"> em biblioteca de referência</w:t>
-      </w:r>
-      <w:r>
-        <w:rPr>
-          <w:rFonts w:ascii="Times New Roman" w:hAnsi="Times New Roman" w:cs="Times New Roman"/>
-          <w:sz w:val="24"/>
-          <w:szCs w:val="24"/>
-        </w:rPr>
-        <w:t xml:space="preserve"> </w:t>
-      </w:r>
-      <w:r>
-        <w:rPr>
-          <w:rFonts w:ascii="Times New Roman" w:eastAsia="Times New Roman" w:hAnsi="Times New Roman" w:cs="Times New Roman"/>
-          <w:sz w:val="24"/>
-          <w:szCs w:val="24"/>
-        </w:rPr>
-        <w:t xml:space="preserve">consultada por meio do software </w:t>
-      </w:r>
-      <w:r>
-        <w:rPr>
-          <w:rFonts w:ascii="Times New Roman" w:eastAsia="Times New Roman" w:hAnsi="Times New Roman" w:cs="Times New Roman"/>
+        <w:t>Cocaína Base — benzoilmetilecgonina</w:t>
+      </w:r>
+      <w:r>
+        <w:rPr>
+          <w:rFonts w:ascii="Times New Roman" w:hAnsi="Times New Roman" w:cs="Times New Roman"/>
+          <w:sz w:val="24"/>
+          <w:szCs w:val="24"/>
+        </w:rPr>
+        <w:t xml:space="preserve">, nome IUPAC: </w:t>
+      </w:r>
+      <w:r>
+        <w:rPr>
+          <w:rFonts w:ascii="Times New Roman" w:hAnsi="Times New Roman" w:cs="Times New Roman"/>
           <w:i/>
           <w:iCs/>
           <w:sz w:val="24"/>
           <w:szCs w:val="24"/>
         </w:rPr>
-        <w:t xml:space="preserve">OPUS </w:t>
-      </w:r>
-      <w:proofErr w:type="spellStart"/>
-      <w:r>
-        <w:rPr>
-          <w:rFonts w:ascii="Times New Roman" w:eastAsia="Times New Roman" w:hAnsi="Times New Roman" w:cs="Times New Roman"/>
-          <w:i/>
-          <w:iCs/>
-          <w:sz w:val="24"/>
-          <w:szCs w:val="24"/>
-        </w:rPr>
-        <w:t>DrugID</w:t>
-      </w:r>
-      <w:proofErr w:type="spellEnd"/>
-      <w:r>
-        <w:rPr>
-          <w:rFonts w:ascii="Times New Roman" w:eastAsia="Times New Roman" w:hAnsi="Times New Roman" w:cs="Times New Roman"/>
-          <w:i/>
-          <w:iCs/>
-          <w:sz w:val="24"/>
-          <w:szCs w:val="24"/>
-        </w:rPr>
-        <w:t xml:space="preserve"> </w:t>
-      </w:r>
-      <w:proofErr w:type="spellStart"/>
-      <w:r>
-        <w:rPr>
-          <w:rFonts w:ascii="Times New Roman" w:eastAsia="Times New Roman" w:hAnsi="Times New Roman" w:cs="Times New Roman"/>
-          <w:i/>
-          <w:iCs/>
-          <w:sz w:val="24"/>
-          <w:szCs w:val="24"/>
-        </w:rPr>
-        <w:t>Wizard</w:t>
-      </w:r>
-      <w:proofErr w:type="spellEnd"/>
-      <w:r>
-        <w:rPr>
-          <w:rFonts w:ascii="Times New Roman" w:hAnsi="Times New Roman" w:cs="Times New Roman"/>
-          <w:sz w:val="24"/>
-          <w:szCs w:val="24"/>
-        </w:rPr>
-        <w:t xml:space="preserve">. Observou-se concordância com bandas espectrais diagnósticas atribuíveis à </w:t>
-      </w:r>
-      <w:r>
-        <w:rPr>
-          <w:rFonts w:ascii="Times New Roman" w:hAnsi="Times New Roman" w:cs="Times New Roman"/>
-          <w:b/>
-          <w:bCs/>
-          <w:sz w:val="24"/>
-          <w:szCs w:val="24"/>
-        </w:rPr>
-        <w:t xml:space="preserve">Cocaína Base — </w:t>
-      </w:r>
-      <w:proofErr w:type="spellStart"/>
-      <w:r>
-        <w:rPr>
-          <w:rFonts w:ascii="Times New Roman" w:hAnsi="Times New Roman" w:cs="Times New Roman"/>
-          <w:b/>
-          <w:bCs/>
-          <w:sz w:val="24"/>
-          <w:szCs w:val="24"/>
-        </w:rPr>
-        <w:t>benzoilmetilecgonina</w:t>
-      </w:r>
-      <w:proofErr w:type="spellEnd"/>
-      <w:r>
-        <w:rPr>
-          <w:rFonts w:ascii="Times New Roman" w:hAnsi="Times New Roman" w:cs="Times New Roman"/>
-          <w:sz w:val="24"/>
-          <w:szCs w:val="24"/>
-        </w:rPr>
-        <w:t xml:space="preserve">, nome IUPAC: </w:t>
-      </w:r>
-      <w:r>
-        <w:rPr>
-          <w:rFonts w:ascii="Times New Roman" w:hAnsi="Times New Roman" w:cs="Times New Roman"/>
-          <w:i/>
-          <w:iCs/>
-          <w:sz w:val="24"/>
-          <w:szCs w:val="24"/>
-        </w:rPr>
-        <w:t>metil (1R,2R,3S,5</w:t>
-      </w:r>
-      <w:proofErr w:type="gramStart"/>
-      <w:r>
-        <w:rPr>
-          <w:rFonts w:ascii="Times New Roman" w:hAnsi="Times New Roman" w:cs="Times New Roman"/>
-          <w:i/>
-          <w:iCs/>
-          <w:sz w:val="24"/>
-          <w:szCs w:val="24"/>
-        </w:rPr>
-        <w:t>S)-</w:t>
-      </w:r>
-      <w:proofErr w:type="gramEnd"/>
-      <w:r>
-        <w:rPr>
-          <w:rFonts w:ascii="Times New Roman" w:hAnsi="Times New Roman" w:cs="Times New Roman"/>
-          <w:i/>
-          <w:iCs/>
-          <w:sz w:val="24"/>
-          <w:szCs w:val="24"/>
-        </w:rPr>
-        <w:t>3-(benzoiloxi)-8-metil-8-azabiciclo[3.2.1]octano-2-carboxilato</w:t>
-      </w:r>
-      <w:r>
-        <w:rPr>
-          <w:rFonts w:ascii="Times New Roman" w:hAnsi="Times New Roman" w:cs="Times New Roman"/>
-          <w:sz w:val="24"/>
-          <w:szCs w:val="24"/>
-        </w:rPr>
-        <w:t>. Fórmula molecular: C₁₇H₂₁NO₄. Peso molecular: 303,4 g/mol.</w:t>
+        <w:t>metil (1R,2R,3S,5S)-3-(benzoiloxi)-8-metil-8-azabiciclo[3.2.1]octano-2-carboxilato</w:t>
+      </w:r>
+      <w:r>
+        <w:rPr>
+          <w:rFonts w:ascii="Times New Roman" w:hAnsi="Times New Roman" w:cs="Times New Roman"/>
+          <w:sz w:val="24"/>
+          <w:szCs w:val="24"/>
+        </w:rPr>
+        <w:t>. Fórmula molecular</w:t>
+      </w:r>
+      <w:r>
+        <w:rPr>
+          <w:rFonts w:ascii="Times New Roman" w:hAnsi="Times New Roman" w:cs="Times New Roman"/>
+          <w:sz w:val="24"/>
+          <w:szCs w:val="24"/>
+        </w:rPr>
+        <w:t>: C₁₇H₂₁NO₄. Peso molecular: 303,4 g/mol. O número de registro CAS 50-36-2 corresponde à cocaína base livre, confirmando tratar-se de cocaína base (crack) e não de cloridrato de cocaína (CAS 53-21-4).</w:t>
       </w:r>
     </w:p>
     <w:tbl>
@@ -4202,21 +4322,12 @@
         <w:spacing w:before="80" w:after="80"/>
         <w:rPr>
           <w:rFonts w:ascii="Times New Roman" w:hAnsi="Times New Roman" w:cs="Times New Roman"/>
-          <w:sz w:val="20"/>
-          <w:szCs w:val="20"/>
-        </w:rPr>
-      </w:pPr>
-      <w:r>
-        <w:rPr>
-          <w:rFonts w:ascii="Times New Roman" w:hAnsi="Times New Roman" w:cs="Times New Roman"/>
           <w:i/>
           <w:iCs/>
           <w:sz w:val="20"/>
           <w:szCs w:val="20"/>
         </w:rPr>
-        <w:t>Tabela 3. Bandas espectrais diagnósticas — FTIR-ATR — Cocaína Base (</w:t>
-      </w:r>
-      <w:proofErr w:type="spellStart"/>
+      </w:pPr>
       <w:r>
         <w:rPr>
           <w:rFonts w:ascii="Times New Roman" w:hAnsi="Times New Roman" w:cs="Times New Roman"/>
@@ -4225,9 +4336,9 @@
           <w:sz w:val="20"/>
           <w:szCs w:val="20"/>
         </w:rPr>
-        <w:t>benzoilmetilecgonina</w:t>
-      </w:r>
-      <w:proofErr w:type="spellEnd"/>
+        <w:t>Tabela 3. Bandas espectrais diagnósticas — FTIR-ATR — Cocaína Base (</w:t>
+      </w:r>
+      <w:proofErr w:type="spellStart"/>
       <w:r>
         <w:rPr>
           <w:rFonts w:ascii="Times New Roman" w:hAnsi="Times New Roman" w:cs="Times New Roman"/>
@@ -4236,28 +4347,45 @@
           <w:sz w:val="20"/>
           <w:szCs w:val="20"/>
         </w:rPr>
-        <w:t>).</w:t>
-      </w:r>
-    </w:p>
-    <w:p>
-      <w:pPr>
-        <w:spacing w:before="80" w:after="80"/>
-        <w:jc w:val="center"/>
+        <w:t>benzoilmetilecgonina</w:t>
+      </w:r>
+      <w:proofErr w:type="spellEnd"/>
+      <w:r>
         <w:rPr>
           <w:rFonts w:ascii="Times New Roman" w:hAnsi="Times New Roman" w:cs="Times New Roman"/>
           <w:i/>
           <w:iCs/>
+          <w:sz w:val="20"/>
+          <w:szCs w:val="20"/>
+        </w:rPr>
+        <w:t>).</w:t>
+      </w:r>
+    </w:p>
+    <w:p>
+      <w:pPr>
+        <w:spacing w:before="80" w:after="80"/>
+        <w:rPr>
+          <w:rFonts w:ascii="Times New Roman" w:hAnsi="Times New Roman" w:cs="Times New Roman"/>
+          <w:sz w:val="20"/>
+          <w:szCs w:val="20"/>
         </w:rPr>
       </w:pPr>
       <w:r>
         <w:rPr>
           <w:noProof/>
         </w:rPr>
-        <w:lastRenderedPageBreak/>
         <w:drawing>
-          <wp:inline distT="0" distB="0" distL="0" distR="0" wp14:anchorId="07730393" wp14:editId="05C27B7C">
+          <wp:anchor distT="0" distB="0" distL="114300" distR="114300" simplePos="0" relativeHeight="251660288" behindDoc="0" locked="0" layoutInCell="1" allowOverlap="1" wp14:anchorId="33F5CD09" wp14:editId="77C79374">
+            <wp:simplePos x="0" y="0"/>
+            <wp:positionH relativeFrom="margin">
+              <wp:posOffset>3712740</wp:posOffset>
+            </wp:positionH>
+            <wp:positionV relativeFrom="paragraph">
+              <wp:posOffset>261620</wp:posOffset>
+            </wp:positionV>
             <wp:extent cx="2292350" cy="1208445"/>
             <wp:effectExtent l="0" t="0" r="0" b="0"/>
+            <wp:wrapNone/>
             <wp:docPr id="1" name="Imagem 1" descr="Fórmula Estrutural Da Cocaína Ilustração do Vetor - Ilustração de veneno,  oxigênio: 22477897"/>
             <wp:cNvGraphicFramePr>
               <a:graphicFrameLocks xmlns:a="http://schemas.openxmlformats.org/drawingml/2006/main" noChangeAspect="1"/>
@@ -4272,7 +4400,7 @@
                     </pic:cNvPicPr>
                   </pic:nvPicPr>
                   <pic:blipFill rotWithShape="1">
-                    <a:blip r:embed="rId11" cstate="print">
+                    <a:blip r:embed="rId12" cstate="print">
                       <a:extLst>
                         <a:ext uri="{28A0092B-C50C-407E-A947-70E740481C1C}">
                           <a14:useLocalDpi xmlns:a14="http://schemas.microsoft.com/office/drawing/2010/main" val="0"/>
@@ -4285,7 +4413,7 @@
                   <pic:spPr bwMode="auto">
                     <a:xfrm>
                       <a:off x="0" y="0"/>
-                      <a:ext cx="2316089" cy="1220959"/>
+                      <a:ext cx="2292350" cy="1208445"/>
                     </a:xfrm>
                     <a:prstGeom prst="rect">
                       <a:avLst/>
@@ -4303,6 +4431,54 @@
                 </pic:pic>
               </a:graphicData>
             </a:graphic>
+            <wp14:sizeRelH relativeFrom="page">
+              <wp14:pctWidth>0</wp14:pctWidth>
+            </wp14:sizeRelH>
+            <wp14:sizeRelV relativeFrom="page">
+              <wp14:pctHeight>0</wp14:pctHeight>
+            </wp14:sizeRelV>
+          </wp:anchor>
+        </w:drawing>
+      </w:r>
+      <w:r>
+        <w:rPr>
+          <w:rFonts w:ascii="Times New Roman" w:hAnsi="Times New Roman" w:cs="Times New Roman"/>
+          <w:sz w:val="20"/>
+          <w:szCs w:val="20"/>
+        </w:rPr>
+        <w:drawing>
+          <wp:inline distT="0" distB="0" distL="0" distR="0" wp14:anchorId="3E70CA64" wp14:editId="081144E9">
+            <wp:extent cx="6120130" cy="2639060"/>
+            <wp:effectExtent l="0" t="0" r="0" b="8890"/>
+            <wp:docPr id="3" name="Imagem 3"/>
+            <wp:cNvGraphicFramePr>
+              <a:graphicFrameLocks xmlns:a="http://schemas.openxmlformats.org/drawingml/2006/main" noChangeAspect="1"/>
+            </wp:cNvGraphicFramePr>
+            <a:graphic xmlns:a="http://schemas.openxmlformats.org/drawingml/2006/main">
+              <a:graphicData uri="http://schemas.openxmlformats.org/drawingml/2006/picture">
+                <pic:pic xmlns:pic="http://schemas.openxmlformats.org/drawingml/2006/picture">
+                  <pic:nvPicPr>
+                    <pic:cNvPr id="1" name=""/>
+                    <pic:cNvPicPr/>
+                  </pic:nvPicPr>
+                  <pic:blipFill>
+                    <a:blip r:embed="rId13"/>
+                    <a:stretch>
+                      <a:fillRect/>
+                    </a:stretch>
+                  </pic:blipFill>
+                  <pic:spPr>
+                    <a:xfrm>
+                      <a:off x="0" y="0"/>
+                      <a:ext cx="6120130" cy="2639060"/>
+                    </a:xfrm>
+                    <a:prstGeom prst="rect">
+                      <a:avLst/>
+                    </a:prstGeom>
+                  </pic:spPr>
+                </pic:pic>
+              </a:graphicData>
+            </a:graphic>
           </wp:inline>
         </w:drawing>
       </w:r>
@@ -4310,7 +4486,7 @@
     <w:p>
       <w:pPr>
         <w:spacing w:before="80" w:after="80"/>
-        <w:jc w:val="center"/>
+        <w:jc w:val="both"/>
         <w:rPr>
           <w:rFonts w:ascii="Times New Roman" w:hAnsi="Times New Roman" w:cs="Times New Roman"/>
           <w:i/>
@@ -4321,47 +4497,113 @@
       </w:pPr>
       <w:r>
         <w:rPr>
+          <w:rStyle w:val="Forte"/>
+          <w:rFonts w:ascii="Times New Roman" w:hAnsi="Times New Roman" w:cs="Times New Roman"/>
+          <w:b w:val="0"/>
+          <w:i/>
+          <w:sz w:val="20"/>
+          <w:szCs w:val="20"/>
+        </w:rPr>
+        <w:t>Figura 2</w:t>
+      </w:r>
+      <w:r>
+        <w:rPr>
+          <w:rStyle w:val="Forte"/>
+          <w:rFonts w:ascii="Times New Roman" w:hAnsi="Times New Roman" w:cs="Times New Roman"/>
+          <w:i/>
+          <w:sz w:val="20"/>
+          <w:szCs w:val="20"/>
+        </w:rPr>
+        <w:t>.</w:t>
+      </w:r>
+      <w:r>
+        <w:rPr>
+          <w:rFonts w:ascii="Times New Roman" w:hAnsi="Times New Roman" w:cs="Times New Roman"/>
+          <w:i/>
+          <w:sz w:val="20"/>
+          <w:szCs w:val="20"/>
+        </w:rPr>
+        <w:t xml:space="preserve"> Espectro de absorção no infravermelho médio obtido por FTIR-ATR (vermelho, superior) e espectro de referência da biblioteca [BIBLIOTECA] — entrada nº [ENTRADA_NR] (azul, inferior). A sobreposição evidencia concordância das bandas diagnósticas atribuíveis à </w:t>
+      </w:r>
+      <w:r>
+        <w:rPr>
+          <w:rStyle w:val="Forte"/>
+          <w:rFonts w:ascii="Times New Roman" w:hAnsi="Times New Roman" w:cs="Times New Roman"/>
+          <w:b w:val="0"/>
+          <w:i/>
+          <w:sz w:val="20"/>
+          <w:szCs w:val="20"/>
+        </w:rPr>
+        <w:t xml:space="preserve">Cocaína Base — </w:t>
+      </w:r>
+      <w:proofErr w:type="spellStart"/>
+      <w:r>
+        <w:rPr>
+          <w:rStyle w:val="Forte"/>
+          <w:rFonts w:ascii="Times New Roman" w:hAnsi="Times New Roman" w:cs="Times New Roman"/>
+          <w:b w:val="0"/>
+          <w:i/>
+          <w:sz w:val="20"/>
+          <w:szCs w:val="20"/>
+        </w:rPr>
+        <w:t>Benzoilmetilecgonina</w:t>
+      </w:r>
+      <w:proofErr w:type="spellEnd"/>
+      <w:r>
+        <w:rPr>
+          <w:rFonts w:ascii="Times New Roman" w:hAnsi="Times New Roman" w:cs="Times New Roman"/>
+          <w:i/>
+          <w:sz w:val="20"/>
+          <w:szCs w:val="20"/>
+        </w:rPr>
+        <w:t xml:space="preserve"> (C₁₇H₂₁NO₄; PM 303,</w:t>
+      </w:r>
+      <w:r>
+        <w:rPr>
+          <w:rFonts w:ascii="Times New Roman" w:hAnsi="Times New Roman" w:cs="Times New Roman"/>
+          <w:i/>
+          <w:sz w:val="20"/>
+          <w:szCs w:val="20"/>
+        </w:rPr>
+        <w:t>4</w:t>
+      </w:r>
+      <w:r>
+        <w:rPr>
+          <w:rFonts w:ascii="Times New Roman" w:hAnsi="Times New Roman" w:cs="Times New Roman"/>
+          <w:i/>
+          <w:sz w:val="20"/>
+          <w:szCs w:val="20"/>
+        </w:rPr>
+        <w:t xml:space="preserve"> g/mol; CAS 50-36-2)</w:t>
+      </w:r>
+      <w:r>
+        <w:rPr>
+          <w:rFonts w:ascii="Times New Roman" w:hAnsi="Times New Roman" w:cs="Times New Roman"/>
+          <w:i/>
+          <w:sz w:val="20"/>
+          <w:szCs w:val="20"/>
+        </w:rPr>
+        <w:t xml:space="preserve"> e sua e</w:t>
+      </w:r>
+      <w:r>
+        <w:rPr>
           <w:rFonts w:ascii="Times New Roman" w:hAnsi="Times New Roman" w:cs="Times New Roman"/>
           <w:i/>
           <w:iCs/>
           <w:sz w:val="20"/>
           <w:szCs w:val="20"/>
         </w:rPr>
-        <w:t xml:space="preserve">Estrutura química da </w:t>
-      </w:r>
-      <w:r>
-        <w:rPr>
-          <w:rFonts w:ascii="Times New Roman" w:hAnsi="Times New Roman" w:cs="Times New Roman"/>
-          <w:b/>
-          <w:bCs/>
+        <w:t>strutura química</w:t>
+      </w:r>
+      <w:r>
+        <w:rPr>
+          <w:rFonts w:ascii="Times New Roman" w:hAnsi="Times New Roman" w:cs="Times New Roman"/>
           <w:i/>
           <w:iCs/>
           <w:sz w:val="20"/>
           <w:szCs w:val="20"/>
         </w:rPr>
-        <w:t>Cocaína</w:t>
-      </w:r>
-    </w:p>
-    <w:bookmarkEnd w:id="2"/>
-    <w:p>
-      <w:pPr>
-        <w:pStyle w:val="Ttulo1"/>
-        <w:rPr>
-          <w:rFonts w:ascii="Times New Roman" w:hAnsi="Times New Roman" w:cs="Times New Roman"/>
-        </w:rPr>
-      </w:pPr>
-      <w:r>
-        <w:rPr>
-          <w:rFonts w:ascii="Times New Roman" w:hAnsi="Times New Roman" w:cs="Times New Roman"/>
-        </w:rPr>
-        <w:t>4.   CONCLUSÃO</w:t>
-      </w:r>
-      <w:r>
-        <w:rPr>
-          <w:rStyle w:val="Refdenotaderodap"/>
-          <w:rFonts w:ascii="Times New Roman" w:hAnsi="Times New Roman" w:cs="Times New Roman"/>
-        </w:rPr>
-        <w:footnoteReference w:id="4"/>
+        <w:t>.</w:t>
       </w:r>
     </w:p>
     <w:p>
@@ -4370,16 +4612,54 @@
         <w:jc w:val="both"/>
         <w:rPr>
           <w:rFonts w:ascii="Times New Roman" w:hAnsi="Times New Roman" w:cs="Times New Roman"/>
-          <w:sz w:val="24"/>
-          <w:szCs w:val="24"/>
-        </w:rPr>
-      </w:pPr>
-      <w:r>
-        <w:rPr>
-          <w:rFonts w:ascii="Times New Roman" w:hAnsi="Times New Roman" w:cs="Times New Roman"/>
-          <w:sz w:val="24"/>
-          <w:szCs w:val="24"/>
-        </w:rPr>
+          <w:i/>
+          <w:iCs/>
+          <w:sz w:val="20"/>
+          <w:szCs w:val="20"/>
+        </w:rPr>
+      </w:pPr>
+      <w:bookmarkStart w:id="3" w:name="_GoBack"/>
+      <w:bookmarkEnd w:id="3"/>
+    </w:p>
+    <w:bookmarkEnd w:id="2"/>
+    <w:p>
+      <w:pPr>
+        <w:pStyle w:val="Ttulo1"/>
+        <w:rPr>
+          <w:rFonts w:ascii="Times New Roman" w:hAnsi="Times New Roman" w:cs="Times New Roman"/>
+        </w:rPr>
+      </w:pPr>
+      <w:r>
+        <w:rPr>
+          <w:rFonts w:ascii="Times New Roman" w:hAnsi="Times New Roman" w:cs="Times New Roman"/>
+        </w:rPr>
+        <w:t>4.   CONCLUSÃO</w:t>
+      </w:r>
+      <w:r>
+        <w:rPr>
+          <w:rStyle w:val="Refdenotaderodap"/>
+          <w:rFonts w:ascii="Times New Roman" w:hAnsi="Times New Roman" w:cs="Times New Roman"/>
+        </w:rPr>
+        <w:footnoteReference w:id="4"/>
+      </w:r>
+    </w:p>
+    <w:p>
+      <w:pPr>
+        <w:spacing w:before="80" w:after="80"/>
+        <w:jc w:val="both"/>
+        <w:rPr>
+          <w:rFonts w:ascii="Times New Roman" w:hAnsi="Times New Roman" w:cs="Times New Roman"/>
+          <w:sz w:val="24"/>
+          <w:szCs w:val="24"/>
+        </w:rPr>
+      </w:pPr>
+      <w:r>
+        <w:rPr>
+          <w:rFonts w:ascii="Times New Roman" w:hAnsi="Times New Roman" w:cs="Times New Roman"/>
+          <w:sz w:val="24"/>
+          <w:szCs w:val="24"/>
+        </w:rPr>
+        <w:lastRenderedPageBreak/>
         <w:t>Com fundamento nos exames realizados — ensaios colorimétricos presuntivos (</w:t>
       </w:r>
       <w:r>
@@ -4427,7 +4707,7 @@
           <w:szCs w:val="24"/>
         </w:rPr>
       </w:pPr>
-      <w:bookmarkStart w:id="3" w:name="_Hlk231493053"/>
+      <w:bookmarkStart w:id="4" w:name="_Hlk231493053"/>
     </w:p>
     <w:tbl>
       <w:tblPr>
@@ -4679,7 +4959,7 @@
         </w:rPr>
       </w:pPr>
     </w:p>
-    <w:bookmarkEnd w:id="3"/>
+    <w:bookmarkEnd w:id="4"/>
     <w:p>
       <w:pPr>
         <w:rPr>
@@ -5050,7 +5330,95 @@
                 <w:sz w:val="20"/>
                 <w:szCs w:val="20"/>
               </w:rPr>
-              <w:t>[EMISSOR]</w:t>
+              <w:t xml:space="preserve">1ª </w:t>
+            </w:r>
+            <w:r>
+              <w:rPr>
+                <w:rFonts w:ascii="Times New Roman" w:hAnsi="Times New Roman" w:cs="Times New Roman"/>
+                <w:sz w:val="20"/>
+                <w:szCs w:val="20"/>
+              </w:rPr>
+              <w:t xml:space="preserve">SECCIONAL PARNAÍBA </w:t>
+            </w:r>
+            <w:r>
+              <w:rPr>
+                <w:rFonts w:ascii="Times New Roman" w:hAnsi="Times New Roman" w:cs="Times New Roman"/>
+                <w:sz w:val="20"/>
+                <w:szCs w:val="20"/>
+              </w:rPr>
+              <w:t xml:space="preserve">– </w:t>
+            </w:r>
+            <w:r>
+              <w:rPr>
+                <w:rFonts w:ascii="Times New Roman" w:hAnsi="Times New Roman" w:cs="Times New Roman"/>
+                <w:sz w:val="20"/>
+                <w:szCs w:val="20"/>
+              </w:rPr>
+              <w:t xml:space="preserve">CENTRAL DE FLAGRANTES </w:t>
+            </w:r>
+            <w:r>
+              <w:rPr>
+                <w:rFonts w:ascii="Times New Roman" w:hAnsi="Times New Roman" w:cs="Times New Roman"/>
+                <w:sz w:val="20"/>
+                <w:szCs w:val="20"/>
+              </w:rPr>
+              <w:t>(</w:t>
+            </w:r>
+            <w:r>
+              <w:rPr>
+                <w:rFonts w:ascii="Times New Roman" w:hAnsi="Times New Roman" w:cs="Times New Roman"/>
+                <w:sz w:val="20"/>
+                <w:szCs w:val="20"/>
+              </w:rPr>
+              <w:t>AISP I</w:t>
+            </w:r>
+            <w:r>
+              <w:rPr>
+                <w:rFonts w:ascii="Times New Roman" w:hAnsi="Times New Roman" w:cs="Times New Roman"/>
+                <w:sz w:val="20"/>
+                <w:szCs w:val="20"/>
+              </w:rPr>
+              <w:t xml:space="preserve">, </w:t>
+            </w:r>
+            <w:r>
+              <w:rPr>
+                <w:rFonts w:ascii="Times New Roman" w:hAnsi="Times New Roman" w:cs="Times New Roman"/>
+                <w:sz w:val="20"/>
+                <w:szCs w:val="20"/>
+              </w:rPr>
+              <w:t>II E III</w:t>
+            </w:r>
+            <w:r>
+              <w:rPr>
+                <w:rFonts w:ascii="Times New Roman" w:hAnsi="Times New Roman" w:cs="Times New Roman"/>
+                <w:sz w:val="20"/>
+                <w:szCs w:val="20"/>
+              </w:rPr>
+              <w:t xml:space="preserve">) – </w:t>
+            </w:r>
+            <w:r>
+              <w:rPr>
+                <w:rFonts w:ascii="Times New Roman" w:hAnsi="Times New Roman" w:cs="Times New Roman"/>
+                <w:sz w:val="20"/>
+                <w:szCs w:val="20"/>
+              </w:rPr>
+              <w:t>PARNAÍBA</w:t>
+            </w:r>
+            <w:r>
+              <w:rPr>
+                <w:rFonts w:ascii="Times New Roman" w:hAnsi="Times New Roman" w:cs="Times New Roman"/>
+                <w:sz w:val="20"/>
+                <w:szCs w:val="20"/>
+              </w:rPr>
+              <w:t>/</w:t>
+            </w:r>
+            <w:r>
+              <w:rPr>
+                <w:rFonts w:ascii="Times New Roman" w:hAnsi="Times New Roman" w:cs="Times New Roman"/>
+                <w:sz w:val="20"/>
+                <w:szCs w:val="20"/>
+              </w:rPr>
+              <w:t>PI</w:t>
             </w:r>
           </w:p>
         </w:tc>
@@ -5207,7 +5575,55 @@
                 <w:sz w:val="20"/>
                 <w:szCs w:val="20"/>
               </w:rPr>
-              <w:t>[EMISSOR]</w:t>
+              <w:t xml:space="preserve">POLÍCIA CIVIL DO PIAUÍ </w:t>
+            </w:r>
+            <w:r>
+              <w:rPr>
+                <w:rFonts w:ascii="Times New Roman" w:hAnsi="Times New Roman" w:cs="Times New Roman"/>
+                <w:sz w:val="20"/>
+                <w:szCs w:val="20"/>
+              </w:rPr>
+              <w:t xml:space="preserve">– 2ª </w:t>
+            </w:r>
+            <w:r>
+              <w:rPr>
+                <w:rFonts w:ascii="Times New Roman" w:hAnsi="Times New Roman" w:cs="Times New Roman"/>
+                <w:sz w:val="20"/>
+                <w:szCs w:val="20"/>
+              </w:rPr>
+              <w:t xml:space="preserve">DIVISÃO DE REPRESSÃO E COMBATE AO TRÁFICO DE DROGAS </w:t>
+            </w:r>
+            <w:r>
+              <w:rPr>
+                <w:rFonts w:ascii="Times New Roman" w:hAnsi="Times New Roman" w:cs="Times New Roman"/>
+                <w:sz w:val="20"/>
+                <w:szCs w:val="20"/>
+              </w:rPr>
+              <w:t xml:space="preserve">– </w:t>
+            </w:r>
+            <w:r>
+              <w:rPr>
+                <w:rFonts w:ascii="Times New Roman" w:hAnsi="Times New Roman" w:cs="Times New Roman"/>
+                <w:sz w:val="20"/>
+                <w:szCs w:val="20"/>
+              </w:rPr>
+              <w:t>PARNAÍBA</w:t>
+            </w:r>
+            <w:r>
+              <w:rPr>
+                <w:rFonts w:ascii="Times New Roman" w:hAnsi="Times New Roman" w:cs="Times New Roman"/>
+                <w:sz w:val="20"/>
+                <w:szCs w:val="20"/>
+              </w:rPr>
+              <w:t>/</w:t>
+            </w:r>
+            <w:r>
+              <w:rPr>
+                <w:rFonts w:ascii="Times New Roman" w:hAnsi="Times New Roman" w:cs="Times New Roman"/>
+                <w:sz w:val="20"/>
+                <w:szCs w:val="20"/>
+              </w:rPr>
+              <w:t>PI</w:t>
             </w:r>
           </w:p>
         </w:tc>
@@ -5633,7 +6049,6 @@
                 <w:sz w:val="20"/>
                 <w:szCs w:val="20"/>
               </w:rPr>
-              <w:lastRenderedPageBreak/>
               <w:t>Contraprova nº (AMPLO)</w:t>
             </w:r>
           </w:p>
@@ -6057,6 +6472,7 @@
         <w:rPr>
           <w:rFonts w:ascii="Times New Roman" w:hAnsi="Times New Roman" w:cs="Times New Roman"/>
         </w:rPr>
+        <w:lastRenderedPageBreak/>
         <w:t>6.   REFERÊNCIAS BIBLIOGRÁFICAS</w:t>
       </w:r>
     </w:p>
@@ -6109,7 +6525,25 @@
           <w:sz w:val="16"/>
           <w:szCs w:val="16"/>
         </w:rPr>
-        <w:t xml:space="preserve"> da maconha (Cannabis sativa L.). Química Nova, São Paulo, v. 35, n. 10, p. 2040–2043, 2012.</w:t>
+        <w:t xml:space="preserve"> da maconha (</w:t>
+      </w:r>
+      <w:proofErr w:type="spellStart"/>
+      <w:r>
+        <w:rPr>
+          <w:rFonts w:ascii="Times New Roman" w:eastAsia="Times New Roman" w:hAnsi="Times New Roman" w:cs="Times New Roman"/>
+          <w:sz w:val="16"/>
+          <w:szCs w:val="16"/>
+        </w:rPr>
+        <w:t>Cannabis</w:t>
+      </w:r>
+      <w:proofErr w:type="spellEnd"/>
+      <w:r>
+        <w:rPr>
+          <w:rFonts w:ascii="Times New Roman" w:eastAsia="Times New Roman" w:hAnsi="Times New Roman" w:cs="Times New Roman"/>
+          <w:sz w:val="16"/>
+          <w:szCs w:val="16"/>
+        </w:rPr>
+        <w:t xml:space="preserve"> sativa L.). Química Nova, São Paulo, v. 35, n. 10, p. 2040–2043, 2012.</w:t>
       </w:r>
     </w:p>
     <w:p>
@@ -6256,7 +6690,7 @@
           <w:szCs w:val="16"/>
           <w:lang w:val="en-US"/>
         </w:rPr>
-        <w:t>S.l.</w:t>
+        <w:t>S.l</w:t>
       </w:r>
       <w:proofErr w:type="spellEnd"/>
       <w:r>
@@ -6266,7 +6700,7 @@
           <w:szCs w:val="16"/>
           <w:lang w:val="en-US"/>
         </w:rPr>
-        <w:t>]: Bruker, 2020.</w:t>
+        <w:t>.]: Bruker, 2020.</w:t>
       </w:r>
     </w:p>
     <w:p>
@@ -6293,7 +6727,27 @@
           <w:szCs w:val="16"/>
           <w:lang w:val="en-US"/>
         </w:rPr>
-        <w:t>CASALE, J. F. et al. Four new illicit cocaine impurities from the oxidation of crude cocaine base: formation and characterization of the diastereomeric 2,3-dihydroxy-3-phenylpropionylecgonine methyl esters from cis- and trans-</w:t>
+        <w:t xml:space="preserve">CASALE, J. F. et al. Four new illicit cocaine impurities from the oxidation of crude cocaine base: formation and characterization of the diastereomeric 2,3-dihydroxy-3-phenylpropionylecgonine methyl esters from </w:t>
+      </w:r>
+      <w:proofErr w:type="spellStart"/>
+      <w:r>
+        <w:rPr>
+          <w:rFonts w:ascii="Times New Roman" w:hAnsi="Times New Roman" w:cs="Times New Roman"/>
+          <w:sz w:val="16"/>
+          <w:szCs w:val="16"/>
+          <w:lang w:val="en-US"/>
+        </w:rPr>
+        <w:t>cis</w:t>
+      </w:r>
+      <w:proofErr w:type="spellEnd"/>
+      <w:r>
+        <w:rPr>
+          <w:rFonts w:ascii="Times New Roman" w:hAnsi="Times New Roman" w:cs="Times New Roman"/>
+          <w:sz w:val="16"/>
+          <w:szCs w:val="16"/>
+          <w:lang w:val="en-US"/>
+        </w:rPr>
+        <w:t>- and trans-</w:t>
       </w:r>
       <w:proofErr w:type="spellStart"/>
       <w:r>
@@ -6793,11 +7247,102 @@
     <w:p>
       <w:pPr>
         <w:pStyle w:val="PargrafodaLista"/>
+        <w:numPr>
+          <w:ilvl w:val="0"/>
+          <w:numId w:val="2"/>
+        </w:numPr>
         <w:spacing w:before="40" w:after="60"/>
         <w:ind w:left="567"/>
         <w:jc w:val="both"/>
         <w:rPr>
           <w:rFonts w:ascii="Times New Roman" w:hAnsi="Times New Roman" w:cs="Times New Roman"/>
+          <w:sz w:val="16"/>
+          <w:szCs w:val="16"/>
+        </w:rPr>
+      </w:pPr>
+      <w:r>
+        <w:rPr>
+          <w:rFonts w:ascii="Times New Roman" w:hAnsi="Times New Roman" w:cs="Times New Roman"/>
+          <w:sz w:val="16"/>
+          <w:szCs w:val="16"/>
+        </w:rPr>
+        <w:t>PIAUÍ. Polícia Civil do Estado do Piauí. Portaria nº 56-GDG/AN/2021, de 16 de setembro de 2021. Dispõe sobre procedimentos de apreensão, exame de constatação, laudo definitivo, contraprova e incineração de drogas no âmbito da PC-PI. Teresina: PC-PI, 2</w:t>
+      </w:r>
+      <w:r>
+        <w:rPr>
+          <w:rFonts w:ascii="Times New Roman" w:hAnsi="Times New Roman" w:cs="Times New Roman"/>
+          <w:sz w:val="16"/>
+          <w:szCs w:val="16"/>
+        </w:rPr>
+        <w:t>021. SEI nº 2393293.</w:t>
+      </w:r>
+    </w:p>
+    <w:p>
+      <w:pPr>
+        <w:pStyle w:val="PargrafodaLista"/>
+        <w:numPr>
+          <w:ilvl w:val="0"/>
+          <w:numId w:val="2"/>
+        </w:numPr>
+        <w:spacing w:before="40" w:after="60"/>
+        <w:ind w:left="567"/>
+        <w:jc w:val="both"/>
+        <w:rPr>
+          <w:rFonts w:ascii="Times New Roman" w:hAnsi="Times New Roman" w:cs="Times New Roman"/>
+          <w:sz w:val="16"/>
+          <w:szCs w:val="16"/>
+        </w:rPr>
+      </w:pPr>
+      <w:r>
+        <w:rPr>
+          <w:rFonts w:ascii="Times New Roman" w:hAnsi="Times New Roman" w:cs="Times New Roman"/>
+          <w:sz w:val="16"/>
+          <w:szCs w:val="16"/>
+        </w:rPr>
+        <w:t>PIAUÍ. Secretaria de Segurança Pública. Instrução Normativa nº 04/2025/SSP/PI, de 22 de novembro de 2025. Regula a integração DEPOC/PC-PI e a cadeia de custódia de vestígios. Diário Oficial do Estado do Piauí, n. 229, 28 nov. 2025.</w:t>
+      </w:r>
+    </w:p>
+    <w:p>
+      <w:pPr>
+        <w:pStyle w:val="PargrafodaLista"/>
+        <w:numPr>
+          <w:ilvl w:val="0"/>
+          <w:numId w:val="2"/>
+        </w:numPr>
+        <w:spacing w:before="40" w:after="60"/>
+        <w:ind w:left="567"/>
+        <w:jc w:val="both"/>
+        <w:rPr>
+          <w:rFonts w:ascii="Times New Roman" w:hAnsi="Times New Roman" w:cs="Times New Roman"/>
+          <w:sz w:val="16"/>
+          <w:szCs w:val="16"/>
+        </w:rPr>
+      </w:pPr>
+      <w:r>
+        <w:rPr>
+          <w:rFonts w:ascii="Times New Roman" w:hAnsi="Times New Roman" w:cs="Times New Roman"/>
+          <w:sz w:val="16"/>
+          <w:szCs w:val="16"/>
+        </w:rPr>
+        <w:t>PIA</w:t>
+      </w:r>
+      <w:r>
+        <w:rPr>
+          <w:rFonts w:ascii="Times New Roman" w:hAnsi="Times New Roman" w:cs="Times New Roman"/>
+          <w:sz w:val="16"/>
+          <w:szCs w:val="16"/>
+        </w:rPr>
+        <w:t>UÍ. Departamento de Polícia Científica. ITU-01/2024/CCV-DEPOC, de 21 de outubro de 2024. Instrução Técnica sobre embalagens-padrão rastreáveis e formulário de avaliação de vestígios (FAV). Teresina: DEPOC/PC-PI, 2024.</w:t>
+      </w:r>
+    </w:p>
+    <w:p>
+      <w:pPr>
+        <w:pStyle w:val="PargrafodaLista"/>
+        <w:spacing w:before="40" w:after="60"/>
+        <w:ind w:left="567"/>
+        <w:jc w:val="both"/>
+        <w:rPr>
+          <w:rFonts w:ascii="Times New Roman" w:hAnsi="Times New Roman" w:cs="Times New Roman"/>
           <w:sz w:val="24"/>
           <w:szCs w:val="24"/>
         </w:rPr>
@@ -6847,7 +7392,7 @@
           <w:sz w:val="24"/>
           <w:szCs w:val="24"/>
         </w:rPr>
-        <w:t>6</w:t>
+        <w:t>7</w:t>
       </w:r>
       <w:r>
         <w:rPr>
@@ -6951,9 +7496,9 @@
       </w:r>
     </w:p>
     <w:sectPr>
-      <w:headerReference w:type="default" r:id="rId12"/>
-      <w:headerReference w:type="first" r:id="rId13"/>
-      <w:footerReference w:type="first" r:id="rId14"/>
+      <w:headerReference w:type="default" r:id="rId14"/>
+      <w:headerReference w:type="first" r:id="rId15"/>
+      <w:footerReference w:type="first" r:id="rId16"/>
       <w:pgSz w:w="11906" w:h="16838"/>
       <w:pgMar w:top="426" w:right="1134" w:bottom="426" w:left="1134" w:header="427" w:footer="1277" w:gutter="0"/>
       <w:cols w:space="720"/>
@@ -6965,7 +7510,7 @@
 </file>
 
 <file path=word/endnotes.xml><?xml version="1.0" encoding="utf-8"?>
-<w:endnotes xmlns:wpc="http://schemas.microsoft.com/office/word/2010/wordprocessingCanvas" xmlns:cx="http://schemas.microsoft.com/office/drawing/2014/chartex" xmlns:cx1="http://schemas.microsoft.com/office/drawing/2015/9/8/chartex" xmlns:cx2="http://schemas.microsoft.com/office/drawing/2015/10/21/chartex" xmlns:cx3="http://schemas.microsoft.com/office/drawing/2016/5/9/chartex" xmlns:cx4="http://schemas.microsoft.com/office/drawing/2016/5/10/chartex" xmlns:cx5="http://schemas.microsoft.com/office/drawing/2016/5/11/chartex" xmlns:cx6="http://schemas.microsoft.com/office/drawing/2016/5/12/chartex" xmlns:cx7="http://schemas.microsoft.com/office/drawing/2016/5/13/chartex" xmlns:cx8="http://schemas.microsoft.com/office/drawing/2016/5/14/chartex" xmlns:mc="http://schemas.openxmlformats.org/markup-compatibility/2006" xmlns:aink="http://schemas.microsoft.com/office/drawing/2016/ink" xmlns:am3d="http://schemas.microsoft.com/office/drawing/2017/model3d" xmlns:o="urn:schemas-microsoft-com:office:office" xmlns:r="http://schemas.openxmlformats.org/officeDocument/2006/relationships" xmlns:m="http://schemas.openxmlformats.org/officeDocument/2006/math" xmlns:v="urn:schemas-microsoft-com:vml" xmlns:wp14="http://schemas.microsoft.com/office/word/2010/wordprocessingDrawing" xmlns:wp="http://schemas.openxmlformats.org/drawingml/2006/wordprocessingDrawing" xmlns:w10="urn:schemas-microsoft-com:office:word" xmlns:w="http://schemas.openxmlformats.org/wordprocessingml/2006/main" xmlns:w14="http://schemas.microsoft.com/office/word/2010/wordml" xmlns:w15="http://schemas.microsoft.com/office/word/2012/wordml" xmlns:w16cex="http://schemas.microsoft.com/office/word/2018/wordml/cex" xmlns:w16cid="http://schemas.microsoft.com/office/word/2016/wordml/cid" xmlns:w16="http://schemas.microsoft.com/office/word/2018/wordml" xmlns:w16sdtdh="http://schemas.microsoft.com/office/word/2020/wordml/sdtdatahash" xmlns:w16se="http://schemas.microsoft.com/office/word/2015/wordml/symex" xmlns:wpg="http://schemas.microsoft.com/office/word/2010/wordprocessingGroup" xmlns:wpi="http://schemas.microsoft.com/office/word/2010/wordprocessingInk" xmlns:wne="http://schemas.microsoft.com/office/word/2006/wordml" xmlns:wps="http://schemas.microsoft.com/office/word/2010/wordprocessingShape" mc:Ignorable="w14 w15 w16se w16cid w16 w16cex w16sdtdh wp14">
+<w:endnotes xmlns:wpc="http://schemas.microsoft.com/office/word/2010/wordprocessingCanvas" xmlns:mc="http://schemas.openxmlformats.org/markup-compatibility/2006" xmlns:o="urn:schemas-microsoft-com:office:office" xmlns:r="http://schemas.openxmlformats.org/officeDocument/2006/relationships" xmlns:m="http://schemas.openxmlformats.org/officeDocument/2006/math" xmlns:v="urn:schemas-microsoft-com:vml" xmlns:wp14="http://schemas.microsoft.com/office/word/2010/wordprocessingDrawing" xmlns:wp="http://schemas.openxmlformats.org/drawingml/2006/wordprocessingDrawing" xmlns:w10="urn:schemas-microsoft-com:office:word" xmlns:w="http://schemas.openxmlformats.org/wordprocessingml/2006/main" xmlns:w14="http://schemas.microsoft.com/office/word/2010/wordml" xmlns:w15="http://schemas.microsoft.com/office/word/2012/wordml" xmlns:wpg="http://schemas.microsoft.com/office/word/2010/wordprocessingGroup" xmlns:wpi="http://schemas.microsoft.com/office/word/2010/wordprocessingInk" xmlns:wne="http://schemas.microsoft.com/office/word/2006/wordml" xmlns:wps="http://schemas.microsoft.com/office/word/2010/wordprocessingShape" mc:Ignorable="w14 w15 wp14">
   <w:endnote w:type="separator" w:id="-1">
     <w:p>
       <w:r>
@@ -6984,7 +7529,7 @@
 </file>
 
 <file path=word/footer1.xml><?xml version="1.0" encoding="utf-8"?>
-<w:ftr xmlns:wpc="http://schemas.microsoft.com/office/word/2010/wordprocessingCanvas" xmlns:cx="http://schemas.microsoft.com/office/drawing/2014/chartex" xmlns:cx1="http://schemas.microsoft.com/office/drawing/2015/9/8/chartex" xmlns:cx2="http://schemas.microsoft.com/office/drawing/2015/10/21/chartex" xmlns:cx3="http://schemas.microsoft.com/office/drawing/2016/5/9/chartex" xmlns:cx4="http://schemas.microsoft.com/office/drawing/2016/5/10/chartex" xmlns:cx5="http://schemas.microsoft.com/office/drawing/2016/5/11/chartex" xmlns:cx6="http://schemas.microsoft.com/office/drawing/2016/5/12/chartex" xmlns:cx7="http://schemas.microsoft.com/office/drawing/2016/5/13/chartex" xmlns:cx8="http://schemas.microsoft.com/office/drawing/2016/5/14/chartex" xmlns:mc="http://schemas.openxmlformats.org/markup-compatibility/2006" xmlns:aink="http://schemas.microsoft.com/office/drawing/2016/ink" xmlns:am3d="http://schemas.microsoft.com/office/drawing/2017/model3d" xmlns:o="urn:schemas-microsoft-com:office:office" xmlns:r="http://schemas.openxmlformats.org/officeDocument/2006/relationships" xmlns:m="http://schemas.openxmlformats.org/officeDocument/2006/math" xmlns:v="urn:schemas-microsoft-com:vml" xmlns:wp14="http://schemas.microsoft.com/office/word/2010/wordprocessingDrawing" xmlns:wp="http://schemas.openxmlformats.org/drawingml/2006/wordprocessingDrawing" xmlns:w10="urn:schemas-microsoft-com:office:word" xmlns:w="http://schemas.openxmlformats.org/wordprocessingml/2006/main" xmlns:w14="http://schemas.microsoft.com/office/word/2010/wordml" xmlns:w15="http://schemas.microsoft.com/office/word/2012/wordml" xmlns:w16cex="http://schemas.microsoft.com/office/word/2018/wordml/cex" xmlns:w16cid="http://schemas.microsoft.com/office/word/2016/wordml/cid" xmlns:w16="http://schemas.microsoft.com/office/word/2018/wordml" xmlns:w16sdtdh="http://schemas.microsoft.com/office/word/2020/wordml/sdtdatahash" xmlns:w16se="http://schemas.microsoft.com/office/word/2015/wordml/symex" xmlns:wpg="http://schemas.microsoft.com/office/word/2010/wordprocessingGroup" xmlns:wpi="http://schemas.microsoft.com/office/word/2010/wordprocessingInk" xmlns:wne="http://schemas.microsoft.com/office/word/2006/wordml" xmlns:wps="http://schemas.microsoft.com/office/word/2010/wordprocessingShape" mc:Ignorable="w14 w15 w16se w16cid w16 w16cex w16sdtdh wp14">
+<w:ftr xmlns:wpc="http://schemas.microsoft.com/office/word/2010/wordprocessingCanvas" xmlns:mc="http://schemas.openxmlformats.org/markup-compatibility/2006" xmlns:o="urn:schemas-microsoft-com:office:office" xmlns:r="http://schemas.openxmlformats.org/officeDocument/2006/relationships" xmlns:m="http://schemas.openxmlformats.org/officeDocument/2006/math" xmlns:v="urn:schemas-microsoft-com:vml" xmlns:wp14="http://schemas.microsoft.com/office/word/2010/wordprocessingDrawing" xmlns:wp="http://schemas.openxmlformats.org/drawingml/2006/wordprocessingDrawing" xmlns:w10="urn:schemas-microsoft-com:office:word" xmlns:w="http://schemas.openxmlformats.org/wordprocessingml/2006/main" xmlns:w14="http://schemas.microsoft.com/office/word/2010/wordml" xmlns:w15="http://schemas.microsoft.com/office/word/2012/wordml" xmlns:wpg="http://schemas.microsoft.com/office/word/2010/wordprocessingGroup" xmlns:wpi="http://schemas.microsoft.com/office/word/2010/wordprocessingInk" xmlns:wne="http://schemas.microsoft.com/office/word/2006/wordml" xmlns:wps="http://schemas.microsoft.com/office/word/2010/wordprocessingShape" mc:Ignorable="w14 w15 wp14">
   <w:p>
     <w:pPr>
       <w:pStyle w:val="Rodap"/>
@@ -7072,7 +7617,7 @@
 </file>
 
 <file path=word/footnotes.xml><?xml version="1.0" encoding="utf-8"?>
-<w:footnotes xmlns:wpc="http://schemas.microsoft.com/office/word/2010/wordprocessingCanvas" xmlns:cx="http://schemas.microsoft.com/office/drawing/2014/chartex" xmlns:cx1="http://schemas.microsoft.com/office/drawing/2015/9/8/chartex" xmlns:cx2="http://schemas.microsoft.com/office/drawing/2015/10/21/chartex" xmlns:cx3="http://schemas.microsoft.com/office/drawing/2016/5/9/chartex" xmlns:cx4="http://schemas.microsoft.com/office/drawing/2016/5/10/chartex" xmlns:cx5="http://schemas.microsoft.com/office/drawing/2016/5/11/chartex" xmlns:cx6="http://schemas.microsoft.com/office/drawing/2016/5/12/chartex" xmlns:cx7="http://schemas.microsoft.com/office/drawing/2016/5/13/chartex" xmlns:cx8="http://schemas.microsoft.com/office/drawing/2016/5/14/chartex" xmlns:mc="http://schemas.openxmlformats.org/markup-compatibility/2006" xmlns:aink="http://schemas.microsoft.com/office/drawing/2016/ink" xmlns:am3d="http://schemas.microsoft.com/office/drawing/2017/model3d" xmlns:o="urn:schemas-microsoft-com:office:office" xmlns:r="http://schemas.openxmlformats.org/officeDocument/2006/relationships" xmlns:m="http://schemas.openxmlformats.org/officeDocument/2006/math" xmlns:v="urn:schemas-microsoft-com:vml" xmlns:wp14="http://schemas.microsoft.com/office/word/2010/wordprocessingDrawing" xmlns:wp="http://schemas.openxmlformats.org/drawingml/2006/wordprocessingDrawing" xmlns:w10="urn:schemas-microsoft-com:office:word" xmlns:w="http://schemas.openxmlformats.org/wordprocessingml/2006/main" xmlns:w14="http://schemas.microsoft.com/office/word/2010/wordml" xmlns:w15="http://schemas.microsoft.com/office/word/2012/wordml" xmlns:w16cex="http://schemas.microsoft.com/office/word/2018/wordml/cex" xmlns:w16cid="http://schemas.microsoft.com/office/word/2016/wordml/cid" xmlns:w16="http://schemas.microsoft.com/office/word/2018/wordml" xmlns:w16sdtdh="http://schemas.microsoft.com/office/word/2020/wordml/sdtdatahash" xmlns:w16se="http://schemas.microsoft.com/office/word/2015/wordml/symex" xmlns:wpg="http://schemas.microsoft.com/office/word/2010/wordprocessingGroup" xmlns:wpi="http://schemas.microsoft.com/office/word/2010/wordprocessingInk" xmlns:wne="http://schemas.microsoft.com/office/word/2006/wordml" xmlns:wps="http://schemas.microsoft.com/office/word/2010/wordprocessingShape" mc:Ignorable="w14 w15 w16se w16cid w16 w16cex w16sdtdh wp14">
+<w:footnotes xmlns:wpc="http://schemas.microsoft.com/office/word/2010/wordprocessingCanvas" xmlns:mc="http://schemas.openxmlformats.org/markup-compatibility/2006" xmlns:o="urn:schemas-microsoft-com:office:office" xmlns:r="http://schemas.openxmlformats.org/officeDocument/2006/relationships" xmlns:m="http://schemas.openxmlformats.org/officeDocument/2006/math" xmlns:v="urn:schemas-microsoft-com:vml" xmlns:wp14="http://schemas.microsoft.com/office/word/2010/wordprocessingDrawing" xmlns:wp="http://schemas.openxmlformats.org/drawingml/2006/wordprocessingDrawing" xmlns:w10="urn:schemas-microsoft-com:office:word" xmlns:w="http://schemas.openxmlformats.org/wordprocessingml/2006/main" xmlns:w14="http://schemas.microsoft.com/office/word/2010/wordml" xmlns:w15="http://schemas.microsoft.com/office/word/2012/wordml" xmlns:wpg="http://schemas.microsoft.com/office/word/2010/wordprocessingGroup" xmlns:wpi="http://schemas.microsoft.com/office/word/2010/wordprocessingInk" xmlns:wne="http://schemas.microsoft.com/office/word/2006/wordml" xmlns:wps="http://schemas.microsoft.com/office/word/2010/wordprocessingShape" mc:Ignorable="w14 w15 wp14">
   <w:footnote w:type="separator" w:id="-1">
     <w:p>
       <w:r>
@@ -7160,16 +7705,7 @@
           <w:sz w:val="16"/>
           <w:szCs w:val="16"/>
         </w:rPr>
-        <w:t>) em concentração elevada. Esta ambiguidade é integralmente resolvida pelo FTIR-ATR confirmatório (Cat. A/SWGDRUG), cujos espectros de cocaína e anestésicos locais são inconfundíveis por apresentarem bandas diagnósticas distintas (lidocaína: amida secundária ν C=O ~1665 cm⁻¹; fenacetina: ν C=</w:t>
-      </w:r>
-      <w:proofErr w:type="gramStart"/>
-      <w:r>
-        <w:rPr>
-          <w:rFonts w:ascii="Times New Roman" w:hAnsi="Times New Roman" w:cs="Times New Roman"/>
-          <w:sz w:val="16"/>
-          <w:szCs w:val="16"/>
-        </w:rPr>
-        <w:t>O</w:t>
+        <w:t>) em concentração elevada. Esta ambiguidade é integralmente resolvida pelo FTIR-ATR confirmatório (Cat. A/SWGDRUG), cujos espectros de cocaína e anestésicos locais são inconfundíveis por apresentarem bandas diagnósticas distintas (lidocaína: amida secundária ν C=O ~1665 cm⁻¹; fenacetina: ν C=O</w:t>
       </w:r>
       <w:r>
         <w:rPr>
@@ -7185,16 +7721,7 @@
           <w:sz w:val="16"/>
           <w:szCs w:val="16"/>
         </w:rPr>
-        <w:t>amida</w:t>
-      </w:r>
-      <w:proofErr w:type="gramEnd"/>
-      <w:r>
-        <w:rPr>
-          <w:rFonts w:ascii="Times New Roman" w:hAnsi="Times New Roman" w:cs="Times New Roman"/>
-          <w:sz w:val="16"/>
-          <w:szCs w:val="16"/>
-        </w:rPr>
-        <w:t xml:space="preserve"> ~1660 cm⁻¹; cafeína: ν C=O </w:t>
+        <w:t xml:space="preserve">amida ~1660 cm⁻¹; cafeína: ν C=O </w:t>
       </w:r>
       <w:proofErr w:type="spellStart"/>
       <w:r>
@@ -7419,7 +7946,7 @@
 </file>
 
 <file path=word/header1.xml><?xml version="1.0" encoding="utf-8"?>
-<w:hdr xmlns:wpc="http://schemas.microsoft.com/office/word/2010/wordprocessingCanvas" xmlns:cx="http://schemas.microsoft.com/office/drawing/2014/chartex" xmlns:cx1="http://schemas.microsoft.com/office/drawing/2015/9/8/chartex" xmlns:cx2="http://schemas.microsoft.com/office/drawing/2015/10/21/chartex" xmlns:cx3="http://schemas.microsoft.com/office/drawing/2016/5/9/chartex" xmlns:cx4="http://schemas.microsoft.com/office/drawing/2016/5/10/chartex" xmlns:cx5="http://schemas.microsoft.com/office/drawing/2016/5/11/chartex" xmlns:cx6="http://schemas.microsoft.com/office/drawing/2016/5/12/chartex" xmlns:cx7="http://schemas.microsoft.com/office/drawing/2016/5/13/chartex" xmlns:cx8="http://schemas.microsoft.com/office/drawing/2016/5/14/chartex" xmlns:mc="http://schemas.openxmlformats.org/markup-compatibility/2006" xmlns:aink="http://schemas.microsoft.com/office/drawing/2016/ink" xmlns:am3d="http://schemas.microsoft.com/office/drawing/2017/model3d" xmlns:o="urn:schemas-microsoft-com:office:office" xmlns:r="http://schemas.openxmlformats.org/officeDocument/2006/relationships" xmlns:m="http://schemas.openxmlformats.org/officeDocument/2006/math" xmlns:v="urn:schemas-microsoft-com:vml" xmlns:wp14="http://schemas.microsoft.com/office/word/2010/wordprocessingDrawing" xmlns:wp="http://schemas.openxmlformats.org/drawingml/2006/wordprocessingDrawing" xmlns:w10="urn:schemas-microsoft-com:office:word" xmlns:w="http://schemas.openxmlformats.org/wordprocessingml/2006/main" xmlns:w14="http://schemas.microsoft.com/office/word/2010/wordml" xmlns:w15="http://schemas.microsoft.com/office/word/2012/wordml" xmlns:w16cex="http://schemas.microsoft.com/office/word/2018/wordml/cex" xmlns:w16cid="http://schemas.microsoft.com/office/word/2016/wordml/cid" xmlns:w16="http://schemas.microsoft.com/office/word/2018/wordml" xmlns:w16sdtdh="http://schemas.microsoft.com/office/word/2020/wordml/sdtdatahash" xmlns:w16se="http://schemas.microsoft.com/office/word/2015/wordml/symex" xmlns:wpg="http://schemas.microsoft.com/office/word/2010/wordprocessingGroup" xmlns:wpi="http://schemas.microsoft.com/office/word/2010/wordprocessingInk" xmlns:wne="http://schemas.microsoft.com/office/word/2006/wordml" xmlns:wps="http://schemas.microsoft.com/office/word/2010/wordprocessingShape" mc:Ignorable="w14 w15 w16se w16cid w16 w16cex w16sdtdh wp14">
+<w:hdr xmlns:wpc="http://schemas.microsoft.com/office/word/2010/wordprocessingCanvas" xmlns:mc="http://schemas.openxmlformats.org/markup-compatibility/2006" xmlns:o="urn:schemas-microsoft-com:office:office" xmlns:r="http://schemas.openxmlformats.org/officeDocument/2006/relationships" xmlns:m="http://schemas.openxmlformats.org/officeDocument/2006/math" xmlns:v="urn:schemas-microsoft-com:vml" xmlns:wp14="http://schemas.microsoft.com/office/word/2010/wordprocessingDrawing" xmlns:wp="http://schemas.openxmlformats.org/drawingml/2006/wordprocessingDrawing" xmlns:w10="urn:schemas-microsoft-com:office:word" xmlns:w="http://schemas.openxmlformats.org/wordprocessingml/2006/main" xmlns:w14="http://schemas.microsoft.com/office/word/2010/wordml" xmlns:w15="http://schemas.microsoft.com/office/word/2012/wordml" xmlns:wpg="http://schemas.microsoft.com/office/word/2010/wordprocessingGroup" xmlns:wpi="http://schemas.microsoft.com/office/word/2010/wordprocessingInk" xmlns:wne="http://schemas.microsoft.com/office/word/2006/wordml" xmlns:wps="http://schemas.microsoft.com/office/word/2010/wordprocessingShape" mc:Ignorable="w14 w15 wp14">
   <w:p>
     <w:pPr>
       <w:jc w:val="center"/>
@@ -7471,7 +7998,7 @@
         <w:sz w:val="20"/>
         <w:szCs w:val="20"/>
       </w:rPr>
-      <w:t>[DEMANDA]</w:t>
+      <w:t>00149129-18</w:t>
     </w:r>
     <w:r>
       <w:rPr>
@@ -7520,7 +8047,7 @@
         <w:sz w:val="20"/>
         <w:szCs w:val="20"/>
       </w:rPr>
-      <w:t>7</w:t>
+      <w:t>6</w:t>
     </w:r>
     <w:r>
       <w:rPr>
@@ -7601,7 +8128,7 @@
 </file>
 
 <file path=word/header2.xml><?xml version="1.0" encoding="utf-8"?>
-<w:hdr xmlns:wpc="http://schemas.microsoft.com/office/word/2010/wordprocessingCanvas" xmlns:cx="http://schemas.microsoft.com/office/drawing/2014/chartex" xmlns:cx1="http://schemas.microsoft.com/office/drawing/2015/9/8/chartex" xmlns:cx2="http://schemas.microsoft.com/office/drawing/2015/10/21/chartex" xmlns:cx3="http://schemas.microsoft.com/office/drawing/2016/5/9/chartex" xmlns:cx4="http://schemas.microsoft.com/office/drawing/2016/5/10/chartex" xmlns:cx5="http://schemas.microsoft.com/office/drawing/2016/5/11/chartex" xmlns:cx6="http://schemas.microsoft.com/office/drawing/2016/5/12/chartex" xmlns:cx7="http://schemas.microsoft.com/office/drawing/2016/5/13/chartex" xmlns:cx8="http://schemas.microsoft.com/office/drawing/2016/5/14/chartex" xmlns:mc="http://schemas.openxmlformats.org/markup-compatibility/2006" xmlns:aink="http://schemas.microsoft.com/office/drawing/2016/ink" xmlns:am3d="http://schemas.microsoft.com/office/drawing/2017/model3d" xmlns:o="urn:schemas-microsoft-com:office:office" xmlns:r="http://schemas.openxmlformats.org/officeDocument/2006/relationships" xmlns:m="http://schemas.openxmlformats.org/officeDocument/2006/math" xmlns:v="urn:schemas-microsoft-com:vml" xmlns:wp14="http://schemas.microsoft.com/office/word/2010/wordprocessingDrawing" xmlns:wp="http://schemas.openxmlformats.org/drawingml/2006/wordprocessingDrawing" xmlns:w10="urn:schemas-microsoft-com:office:word" xmlns:w="http://schemas.openxmlformats.org/wordprocessingml/2006/main" xmlns:w14="http://schemas.microsoft.com/office/word/2010/wordml" xmlns:w15="http://schemas.microsoft.com/office/word/2012/wordml" xmlns:w16cex="http://schemas.microsoft.com/office/word/2018/wordml/cex" xmlns:w16cid="http://schemas.microsoft.com/office/word/2016/wordml/cid" xmlns:w16="http://schemas.microsoft.com/office/word/2018/wordml" xmlns:w16sdtdh="http://schemas.microsoft.com/office/word/2020/wordml/sdtdatahash" xmlns:w16se="http://schemas.microsoft.com/office/word/2015/wordml/symex" xmlns:wpg="http://schemas.microsoft.com/office/word/2010/wordprocessingGroup" xmlns:wpi="http://schemas.microsoft.com/office/word/2010/wordprocessingInk" xmlns:wne="http://schemas.microsoft.com/office/word/2006/wordml" xmlns:wps="http://schemas.microsoft.com/office/word/2010/wordprocessingShape" mc:Ignorable="w14 w15 w16se w16cid w16 w16cex w16sdtdh wp14">
+<w:hdr xmlns:wpc="http://schemas.microsoft.com/office/word/2010/wordprocessingCanvas" xmlns:mc="http://schemas.openxmlformats.org/markup-compatibility/2006" xmlns:o="urn:schemas-microsoft-com:office:office" xmlns:r="http://schemas.openxmlformats.org/officeDocument/2006/relationships" xmlns:m="http://schemas.openxmlformats.org/officeDocument/2006/math" xmlns:v="urn:schemas-microsoft-com:vml" xmlns:wp14="http://schemas.microsoft.com/office/word/2010/wordprocessingDrawing" xmlns:wp="http://schemas.openxmlformats.org/drawingml/2006/wordprocessingDrawing" xmlns:w10="urn:schemas-microsoft-com:office:word" xmlns:w="http://schemas.openxmlformats.org/wordprocessingml/2006/main" xmlns:w14="http://schemas.microsoft.com/office/word/2010/wordml" xmlns:w15="http://schemas.microsoft.com/office/word/2012/wordml" xmlns:wpg="http://schemas.microsoft.com/office/word/2010/wordprocessingGroup" xmlns:wpi="http://schemas.microsoft.com/office/word/2010/wordprocessingInk" xmlns:wne="http://schemas.microsoft.com/office/word/2006/wordml" xmlns:wps="http://schemas.microsoft.com/office/word/2010/wordprocessingShape" mc:Ignorable="w14 w15 wp14">
   <w:tbl>
     <w:tblPr>
       <w:tblW w:w="9464" w:type="dxa"/>
@@ -7920,8 +8447,8 @@
 </file>
 
 <file path=word/numbering.xml><?xml version="1.0" encoding="utf-8"?>
-<w:numbering xmlns:wpc="http://schemas.microsoft.com/office/word/2010/wordprocessingCanvas" xmlns:cx="http://schemas.microsoft.com/office/drawing/2014/chartex" xmlns:cx1="http://schemas.microsoft.com/office/drawing/2015/9/8/chartex" xmlns:cx2="http://schemas.microsoft.com/office/drawing/2015/10/21/chartex" xmlns:cx3="http://schemas.microsoft.com/office/drawing/2016/5/9/chartex" xmlns:cx4="http://schemas.microsoft.com/office/drawing/2016/5/10/chartex" xmlns:cx5="http://schemas.microsoft.com/office/drawing/2016/5/11/chartex" xmlns:cx6="http://schemas.microsoft.com/office/drawing/2016/5/12/chartex" xmlns:cx7="http://schemas.microsoft.com/office/drawing/2016/5/13/chartex" xmlns:cx8="http://schemas.microsoft.com/office/drawing/2016/5/14/chartex" xmlns:mc="http://schemas.openxmlformats.org/markup-compatibility/2006" xmlns:aink="http://schemas.microsoft.com/office/drawing/2016/ink" xmlns:am3d="http://schemas.microsoft.com/office/drawing/2017/model3d" xmlns:o="urn:schemas-microsoft-com:office:office" xmlns:r="http://schemas.openxmlformats.org/officeDocument/2006/relationships" xmlns:m="http://schemas.openxmlformats.org/officeDocument/2006/math" xmlns:v="urn:schemas-microsoft-com:vml" xmlns:wp14="http://schemas.microsoft.com/office/word/2010/wordprocessingDrawing" xmlns:wp="http://schemas.openxmlformats.org/drawingml/2006/wordprocessingDrawing" xmlns:w10="urn:schemas-microsoft-com:office:word" xmlns:w="http://schemas.openxmlformats.org/wordprocessingml/2006/main" xmlns:w14="http://schemas.microsoft.com/office/word/2010/wordml" xmlns:w15="http://schemas.microsoft.com/office/word/2012/wordml" xmlns:w16cex="http://schemas.microsoft.com/office/word/2018/wordml/cex" xmlns:w16cid="http://schemas.microsoft.com/office/word/2016/wordml/cid" xmlns:w16="http://schemas.microsoft.com/office/word/2018/wordml" xmlns:w16sdtdh="http://schemas.microsoft.com/office/word/2020/wordml/sdtdatahash" xmlns:w16se="http://schemas.microsoft.com/office/word/2015/wordml/symex" xmlns:wpg="http://schemas.microsoft.com/office/word/2010/wordprocessingGroup" xmlns:wpi="http://schemas.microsoft.com/office/word/2010/wordprocessingInk" xmlns:wne="http://schemas.microsoft.com/office/word/2006/wordml" xmlns:wps="http://schemas.microsoft.com/office/word/2010/wordprocessingShape" mc:Ignorable="w14 w15 w16se w16cid w16 w16cex w16sdtdh wp14">
-  <w:abstractNum w:abstractNumId="0" w15:restartNumberingAfterBreak="0">
+<w:numbering xmlns:wpc="http://schemas.microsoft.com/office/word/2010/wordprocessingCanvas" xmlns:mc="http://schemas.openxmlformats.org/markup-compatibility/2006" xmlns:o="urn:schemas-microsoft-com:office:office" xmlns:r="http://schemas.openxmlformats.org/officeDocument/2006/relationships" xmlns:m="http://schemas.openxmlformats.org/officeDocument/2006/math" xmlns:v="urn:schemas-microsoft-com:vml" xmlns:wp14="http://schemas.microsoft.com/office/word/2010/wordprocessingDrawing" xmlns:wp="http://schemas.openxmlformats.org/drawingml/2006/wordprocessingDrawing" xmlns:w10="urn:schemas-microsoft-com:office:word" xmlns:w="http://schemas.openxmlformats.org/wordprocessingml/2006/main" xmlns:w14="http://schemas.microsoft.com/office/word/2010/wordml" xmlns:w15="http://schemas.microsoft.com/office/word/2012/wordml" xmlns:wpg="http://schemas.microsoft.com/office/word/2010/wordprocessingGroup" xmlns:wpi="http://schemas.microsoft.com/office/word/2010/wordprocessingInk" xmlns:wne="http://schemas.microsoft.com/office/word/2006/wordml" xmlns:wps="http://schemas.microsoft.com/office/word/2010/wordprocessingShape" mc:Ignorable="w14 w15 wp14">
+  <w:abstractNum w:abstractNumId="0">
     <w:nsid w:val="26BB06F5"/>
     <w:multiLevelType w:val="hybridMultilevel"/>
     <w:tmpl w:val="1BF6F9B6"/>
@@ -8034,7 +8561,7 @@
       </w:rPr>
     </w:lvl>
   </w:abstractNum>
-  <w:abstractNum w:abstractNumId="1" w15:restartNumberingAfterBreak="0">
+  <w:abstractNum w:abstractNumId="1">
     <w:nsid w:val="307D5FE8"/>
     <w:multiLevelType w:val="hybridMultilevel"/>
     <w:tmpl w:val="2EF4B676"/>
@@ -8125,7 +8652,7 @@
       </w:pPr>
     </w:lvl>
   </w:abstractNum>
-  <w:abstractNum w:abstractNumId="2" w15:restartNumberingAfterBreak="0">
+  <w:abstractNum w:abstractNumId="2">
     <w:nsid w:val="406774F4"/>
     <w:multiLevelType w:val="hybridMultilevel"/>
     <w:tmpl w:val="16B80A52"/>
@@ -8238,7 +8765,7 @@
       </w:rPr>
     </w:lvl>
   </w:abstractNum>
-  <w:abstractNum w:abstractNumId="3" w15:restartNumberingAfterBreak="0">
+  <w:abstractNum w:abstractNumId="3">
     <w:nsid w:val="49406068"/>
     <w:multiLevelType w:val="hybridMultilevel"/>
     <w:tmpl w:val="EE446D3C"/>
@@ -8329,7 +8856,7 @@
       </w:pPr>
     </w:lvl>
   </w:abstractNum>
-  <w:abstractNum w:abstractNumId="4" w15:restartNumberingAfterBreak="0">
+  <w:abstractNum w:abstractNumId="4">
     <w:nsid w:val="4C97762F"/>
     <w:multiLevelType w:val="hybridMultilevel"/>
     <w:tmpl w:val="9828AAD6"/>
@@ -8442,7 +8969,7 @@
       </w:rPr>
     </w:lvl>
   </w:abstractNum>
-  <w:abstractNum w:abstractNumId="5" w15:restartNumberingAfterBreak="0">
+  <w:abstractNum w:abstractNumId="5">
     <w:nsid w:val="60DF03A0"/>
     <w:multiLevelType w:val="hybridMultilevel"/>
     <w:tmpl w:val="8EB89CDE"/>
@@ -8555,7 +9082,7 @@
       </w:rPr>
     </w:lvl>
   </w:abstractNum>
-  <w:abstractNum w:abstractNumId="6" w15:restartNumberingAfterBreak="0">
+  <w:abstractNum w:abstractNumId="6">
     <w:nsid w:val="7AC24079"/>
     <w:multiLevelType w:val="hybridMultilevel"/>
     <w:tmpl w:val="40FA4C5A"/>
@@ -8641,7 +9168,7 @@
       </w:pPr>
     </w:lvl>
   </w:abstractNum>
-  <w:abstractNum w:abstractNumId="7" w15:restartNumberingAfterBreak="0">
+  <w:abstractNum w:abstractNumId="7">
     <w:nsid w:val="7F6F0B36"/>
     <w:multiLevelType w:val="hybridMultilevel"/>
     <w:tmpl w:val="7CB6CD7C"/>
@@ -8785,7 +9312,7 @@
 </file>
 
 <file path=word/styles.xml><?xml version="1.0" encoding="utf-8"?>
-<w:styles xmlns:mc="http://schemas.openxmlformats.org/markup-compatibility/2006" xmlns:r="http://schemas.openxmlformats.org/officeDocument/2006/relationships" xmlns:w="http://schemas.openxmlformats.org/wordprocessingml/2006/main" xmlns:w14="http://schemas.microsoft.com/office/word/2010/wordml" xmlns:w15="http://schemas.microsoft.com/office/word/2012/wordml" xmlns:w16cex="http://schemas.microsoft.com/office/word/2018/wordml/cex" xmlns:w16cid="http://schemas.microsoft.com/office/word/2016/wordml/cid" xmlns:w16="http://schemas.microsoft.com/office/word/2018/wordml" xmlns:w16sdtdh="http://schemas.microsoft.com/office/word/2020/wordml/sdtdatahash" xmlns:w16se="http://schemas.microsoft.com/office/word/2015/wordml/symex" mc:Ignorable="w14 w15 w16se w16cid w16 w16cex w16sdtdh">
+<w:styles xmlns:mc="http://schemas.openxmlformats.org/markup-compatibility/2006" xmlns:r="http://schemas.openxmlformats.org/officeDocument/2006/relationships" xmlns:w="http://schemas.openxmlformats.org/wordprocessingml/2006/main" xmlns:w14="http://schemas.microsoft.com/office/word/2010/wordml" xmlns:w15="http://schemas.microsoft.com/office/word/2012/wordml" mc:Ignorable="w14 w15">
   <w:docDefaults>
     <w:rPrDefault>
       <w:rPr>
@@ -8797,7 +9324,7 @@
     </w:rPrDefault>
     <w:pPrDefault/>
   </w:docDefaults>
-  <w:latentStyles w:defLockedState="0" w:defUIPriority="99" w:defSemiHidden="0" w:defUnhideWhenUsed="0" w:defQFormat="0" w:count="376">
+  <w:latentStyles w:defLockedState="0" w:defUIPriority="99" w:defSemiHidden="0" w:defUnhideWhenUsed="0" w:defQFormat="0" w:count="371">
     <w:lsdException w:name="Normal" w:uiPriority="0" w:qFormat="1"/>
     <w:lsdException w:name="heading 1" w:uiPriority="9" w:qFormat="1"/>
     <w:lsdException w:name="heading 2" w:semiHidden="1" w:uiPriority="9" w:unhideWhenUsed="1" w:qFormat="1"/>
@@ -9169,11 +9696,6 @@
     <w:lsdException w:name="List Table 5 Dark Accent 6" w:uiPriority="50"/>
     <w:lsdException w:name="List Table 6 Colorful Accent 6" w:uiPriority="51"/>
     <w:lsdException w:name="List Table 7 Colorful Accent 6" w:uiPriority="52"/>
-    <w:lsdException w:name="Mention" w:semiHidden="1" w:unhideWhenUsed="1"/>
-    <w:lsdException w:name="Smart Hyperlink" w:semiHidden="1" w:unhideWhenUsed="1"/>
-    <w:lsdException w:name="Hashtag" w:semiHidden="1" w:unhideWhenUsed="1"/>
-    <w:lsdException w:name="Unresolved Mention" w:semiHidden="1" w:unhideWhenUsed="1"/>
-    <w:lsdException w:name="Smart Link" w:semiHidden="1" w:unhideWhenUsed="1"/>
   </w:latentStyles>
   <w:style w:type="paragraph" w:default="1" w:styleId="Normal">
     <w:name w:val="Normal"/>
@@ -9584,6 +10106,7 @@
     <w:tblPr>
       <w:tblStyleRowBandSize w:val="1"/>
       <w:tblStyleColBandSize w:val="1"/>
+      <w:tblInd w:w="0" w:type="dxa"/>
       <w:tblBorders>
         <w:top w:val="single" w:sz="4" w:space="0" w:color="9CC2E5" w:themeColor="accent5" w:themeTint="99"/>
         <w:left w:val="single" w:sz="4" w:space="0" w:color="9CC2E5" w:themeColor="accent5" w:themeTint="99"/>
@@ -9591,6 +10114,12 @@
         <w:right w:val="single" w:sz="4" w:space="0" w:color="9CC2E5" w:themeColor="accent5" w:themeTint="99"/>
         <w:insideH w:val="single" w:sz="4" w:space="0" w:color="9CC2E5" w:themeColor="accent5" w:themeTint="99"/>
       </w:tblBorders>
+      <w:tblCellMar>
+        <w:top w:w="0" w:type="dxa"/>
+        <w:left w:w="108" w:type="dxa"/>
+        <w:bottom w:w="0" w:type="dxa"/>
+        <w:right w:w="108" w:type="dxa"/>
+      </w:tblCellMar>
     </w:tblPr>
     <w:tblStylePr w:type="firstRow">
       <w:rPr>
@@ -9655,6 +10184,7 @@
     <w:tblPr>
       <w:tblStyleRowBandSize w:val="1"/>
       <w:tblStyleColBandSize w:val="1"/>
+      <w:tblInd w:w="0" w:type="dxa"/>
       <w:tblBorders>
         <w:top w:val="single" w:sz="4" w:space="0" w:color="8EAADB" w:themeColor="accent1" w:themeTint="99"/>
         <w:left w:val="single" w:sz="4" w:space="0" w:color="8EAADB" w:themeColor="accent1" w:themeTint="99"/>
@@ -9662,6 +10192,12 @@
         <w:right w:val="single" w:sz="4" w:space="0" w:color="8EAADB" w:themeColor="accent1" w:themeTint="99"/>
         <w:insideH w:val="single" w:sz="4" w:space="0" w:color="8EAADB" w:themeColor="accent1" w:themeTint="99"/>
       </w:tblBorders>
+      <w:tblCellMar>
+        <w:top w:w="0" w:type="dxa"/>
+        <w:left w:w="108" w:type="dxa"/>
+        <w:bottom w:w="0" w:type="dxa"/>
+        <w:right w:w="108" w:type="dxa"/>
+      </w:tblCellMar>
     </w:tblPr>
     <w:tblStylePr w:type="firstRow">
       <w:rPr>
@@ -9726,6 +10262,7 @@
     <w:tblPr>
       <w:tblStyleRowBandSize w:val="1"/>
       <w:tblStyleColBandSize w:val="1"/>
+      <w:tblInd w:w="0" w:type="dxa"/>
       <w:tblBorders>
         <w:top w:val="single" w:sz="4" w:space="0" w:color="8EAADB" w:themeColor="accent1" w:themeTint="99"/>
         <w:left w:val="single" w:sz="4" w:space="0" w:color="8EAADB" w:themeColor="accent1" w:themeTint="99"/>
@@ -9734,6 +10271,12 @@
         <w:insideH w:val="single" w:sz="4" w:space="0" w:color="8EAADB" w:themeColor="accent1" w:themeTint="99"/>
         <w:insideV w:val="single" w:sz="4" w:space="0" w:color="8EAADB" w:themeColor="accent1" w:themeTint="99"/>
       </w:tblBorders>
+      <w:tblCellMar>
+        <w:top w:w="0" w:type="dxa"/>
+        <w:left w:w="108" w:type="dxa"/>
+        <w:bottom w:w="0" w:type="dxa"/>
+        <w:right w:w="108" w:type="dxa"/>
+      </w:tblCellMar>
     </w:tblPr>
     <w:tblStylePr w:type="firstRow">
       <w:rPr>

</xml_diff>